<commit_message>
Script Word : repère de temps devant chaque réplique
[m:ss] = début de la réplique dans la vidéo de la procédure en ligne (3 min 06 s), d'après A/bornes-allonge.json.

Co-Authored-By: Claude Opus 5.5 <noreply@anthropic.com>
Claude-Session: https://claude.ai/code/session_016YnqtNNUyZYY3JuA5BfKCG
</commit_message>
<xml_diff>
--- a/video/Script_PRO-OP-DD-005.docx
+++ b/video/Script_PRO-OP-DD-005.docx
@@ -4,7 +4,7 @@
   <w:body>
     <w:p>
       <w:pPr>
-        <w:spacing w:after="360"/>
+        <w:spacing w:after="120"/>
       </w:pPr>
       <w:r>
         <w:rPr>
@@ -19,8 +19,34 @@
     </w:p>
     <w:p>
       <w:pPr>
-        <w:spacing w:after="200"/>
-      </w:pPr>
+        <w:spacing w:after="360"/>
+      </w:pPr>
+      <w:r>
+        <w:rPr>
+          <w:rFonts w:ascii="Arial" w:cs="Arial" w:eastAsia="Arial" w:hAnsi="Arial"/>
+          <w:i/>
+          <w:iCs/>
+          <w:color w:val="595959"/>
+          <w:sz w:val="20"/>
+          <w:szCs w:val="20"/>
+        </w:rPr>
+        <w:t xml:space="preserve">Le temps entre crochets indique où la réplique commence dans la vidéo (3 min 06 s).</w:t>
+      </w:r>
+    </w:p>
+    <w:p>
+      <w:pPr>
+        <w:spacing w:after="200"/>
+        <w:ind w:left="900" w:hanging="900"/>
+      </w:pPr>
+      <w:r>
+        <w:rPr>
+          <w:rFonts w:ascii="Arial" w:cs="Arial" w:eastAsia="Arial" w:hAnsi="Arial"/>
+          <w:b/>
+          <w:bCs/>
+          <w:color w:val="1F4E79"/>
+        </w:rPr>
+        <w:t xml:space="preserve">[0:00]	</w:t>
+      </w:r>
       <w:r>
         <w:rPr>
           <w:rFonts w:ascii="Arial" w:cs="Arial" w:eastAsia="Arial" w:hAnsi="Arial"/>
@@ -39,7 +65,17 @@
     <w:p>
       <w:pPr>
         <w:spacing w:after="200"/>
-      </w:pPr>
+        <w:ind w:left="900" w:hanging="900"/>
+      </w:pPr>
+      <w:r>
+        <w:rPr>
+          <w:rFonts w:ascii="Arial" w:cs="Arial" w:eastAsia="Arial" w:hAnsi="Arial"/>
+          <w:b/>
+          <w:bCs/>
+          <w:color w:val="1F4E79"/>
+        </w:rPr>
+        <w:t xml:space="preserve">[0:03]	</w:t>
+      </w:r>
       <w:r>
         <w:rPr>
           <w:rFonts w:ascii="Arial" w:cs="Arial" w:eastAsia="Arial" w:hAnsi="Arial"/>
@@ -58,7 +94,17 @@
     <w:p>
       <w:pPr>
         <w:spacing w:after="200"/>
-      </w:pPr>
+        <w:ind w:left="900" w:hanging="900"/>
+      </w:pPr>
+      <w:r>
+        <w:rPr>
+          <w:rFonts w:ascii="Arial" w:cs="Arial" w:eastAsia="Arial" w:hAnsi="Arial"/>
+          <w:b/>
+          <w:bCs/>
+          <w:color w:val="1F4E79"/>
+        </w:rPr>
+        <w:t xml:space="preserve">[0:06]	</w:t>
+      </w:r>
       <w:r>
         <w:rPr>
           <w:rFonts w:ascii="Arial" w:cs="Arial" w:eastAsia="Arial" w:hAnsi="Arial"/>
@@ -77,7 +123,17 @@
     <w:p>
       <w:pPr>
         <w:spacing w:after="200"/>
-      </w:pPr>
+        <w:ind w:left="900" w:hanging="900"/>
+      </w:pPr>
+      <w:r>
+        <w:rPr>
+          <w:rFonts w:ascii="Arial" w:cs="Arial" w:eastAsia="Arial" w:hAnsi="Arial"/>
+          <w:b/>
+          <w:bCs/>
+          <w:color w:val="1F4E79"/>
+        </w:rPr>
+        <w:t xml:space="preserve">[0:11]	</w:t>
+      </w:r>
       <w:r>
         <w:rPr>
           <w:rFonts w:ascii="Arial" w:cs="Arial" w:eastAsia="Arial" w:hAnsi="Arial"/>
@@ -96,7 +152,17 @@
     <w:p>
       <w:pPr>
         <w:spacing w:after="200"/>
-      </w:pPr>
+        <w:ind w:left="900" w:hanging="900"/>
+      </w:pPr>
+      <w:r>
+        <w:rPr>
+          <w:rFonts w:ascii="Arial" w:cs="Arial" w:eastAsia="Arial" w:hAnsi="Arial"/>
+          <w:b/>
+          <w:bCs/>
+          <w:color w:val="1F4E79"/>
+        </w:rPr>
+        <w:t xml:space="preserve">[0:15]	</w:t>
+      </w:r>
       <w:r>
         <w:rPr>
           <w:rFonts w:ascii="Arial" w:cs="Arial" w:eastAsia="Arial" w:hAnsi="Arial"/>
@@ -115,7 +181,17 @@
     <w:p>
       <w:pPr>
         <w:spacing w:after="200"/>
-      </w:pPr>
+        <w:ind w:left="900" w:hanging="900"/>
+      </w:pPr>
+      <w:r>
+        <w:rPr>
+          <w:rFonts w:ascii="Arial" w:cs="Arial" w:eastAsia="Arial" w:hAnsi="Arial"/>
+          <w:b/>
+          <w:bCs/>
+          <w:color w:val="1F4E79"/>
+        </w:rPr>
+        <w:t xml:space="preserve">[0:20]	</w:t>
+      </w:r>
       <w:r>
         <w:rPr>
           <w:rFonts w:ascii="Arial" w:cs="Arial" w:eastAsia="Arial" w:hAnsi="Arial"/>
@@ -134,7 +210,17 @@
     <w:p>
       <w:pPr>
         <w:spacing w:after="200"/>
-      </w:pPr>
+        <w:ind w:left="900" w:hanging="900"/>
+      </w:pPr>
+      <w:r>
+        <w:rPr>
+          <w:rFonts w:ascii="Arial" w:cs="Arial" w:eastAsia="Arial" w:hAnsi="Arial"/>
+          <w:b/>
+          <w:bCs/>
+          <w:color w:val="1F4E79"/>
+        </w:rPr>
+        <w:t xml:space="preserve">[0:28]	</w:t>
+      </w:r>
       <w:r>
         <w:rPr>
           <w:rFonts w:ascii="Arial" w:cs="Arial" w:eastAsia="Arial" w:hAnsi="Arial"/>
@@ -153,7 +239,17 @@
     <w:p>
       <w:pPr>
         <w:spacing w:after="200"/>
-      </w:pPr>
+        <w:ind w:left="900" w:hanging="900"/>
+      </w:pPr>
+      <w:r>
+        <w:rPr>
+          <w:rFonts w:ascii="Arial" w:cs="Arial" w:eastAsia="Arial" w:hAnsi="Arial"/>
+          <w:b/>
+          <w:bCs/>
+          <w:color w:val="1F4E79"/>
+        </w:rPr>
+        <w:t xml:space="preserve">[0:33]	</w:t>
+      </w:r>
       <w:r>
         <w:rPr>
           <w:rFonts w:ascii="Arial" w:cs="Arial" w:eastAsia="Arial" w:hAnsi="Arial"/>
@@ -172,7 +268,17 @@
     <w:p>
       <w:pPr>
         <w:spacing w:after="200"/>
-      </w:pPr>
+        <w:ind w:left="900" w:hanging="900"/>
+      </w:pPr>
+      <w:r>
+        <w:rPr>
+          <w:rFonts w:ascii="Arial" w:cs="Arial" w:eastAsia="Arial" w:hAnsi="Arial"/>
+          <w:b/>
+          <w:bCs/>
+          <w:color w:val="1F4E79"/>
+        </w:rPr>
+        <w:t xml:space="preserve">[0:41]	</w:t>
+      </w:r>
       <w:r>
         <w:rPr>
           <w:rFonts w:ascii="Arial" w:cs="Arial" w:eastAsia="Arial" w:hAnsi="Arial"/>
@@ -191,7 +297,17 @@
     <w:p>
       <w:pPr>
         <w:spacing w:after="200"/>
-      </w:pPr>
+        <w:ind w:left="900" w:hanging="900"/>
+      </w:pPr>
+      <w:r>
+        <w:rPr>
+          <w:rFonts w:ascii="Arial" w:cs="Arial" w:eastAsia="Arial" w:hAnsi="Arial"/>
+          <w:b/>
+          <w:bCs/>
+          <w:color w:val="1F4E79"/>
+        </w:rPr>
+        <w:t xml:space="preserve">[0:49]	</w:t>
+      </w:r>
       <w:r>
         <w:rPr>
           <w:rFonts w:ascii="Arial" w:cs="Arial" w:eastAsia="Arial" w:hAnsi="Arial"/>
@@ -210,7 +326,17 @@
     <w:p>
       <w:pPr>
         <w:spacing w:after="200"/>
-      </w:pPr>
+        <w:ind w:left="900" w:hanging="900"/>
+      </w:pPr>
+      <w:r>
+        <w:rPr>
+          <w:rFonts w:ascii="Arial" w:cs="Arial" w:eastAsia="Arial" w:hAnsi="Arial"/>
+          <w:b/>
+          <w:bCs/>
+          <w:color w:val="1F4E79"/>
+        </w:rPr>
+        <w:t xml:space="preserve">[1:01]	</w:t>
+      </w:r>
       <w:r>
         <w:rPr>
           <w:rFonts w:ascii="Arial" w:cs="Arial" w:eastAsia="Arial" w:hAnsi="Arial"/>
@@ -229,7 +355,17 @@
     <w:p>
       <w:pPr>
         <w:spacing w:after="200"/>
-      </w:pPr>
+        <w:ind w:left="900" w:hanging="900"/>
+      </w:pPr>
+      <w:r>
+        <w:rPr>
+          <w:rFonts w:ascii="Arial" w:cs="Arial" w:eastAsia="Arial" w:hAnsi="Arial"/>
+          <w:b/>
+          <w:bCs/>
+          <w:color w:val="1F4E79"/>
+        </w:rPr>
+        <w:t xml:space="preserve">[1:08]	</w:t>
+      </w:r>
       <w:r>
         <w:rPr>
           <w:rFonts w:ascii="Arial" w:cs="Arial" w:eastAsia="Arial" w:hAnsi="Arial"/>
@@ -248,7 +384,17 @@
     <w:p>
       <w:pPr>
         <w:spacing w:after="200"/>
-      </w:pPr>
+        <w:ind w:left="900" w:hanging="900"/>
+      </w:pPr>
+      <w:r>
+        <w:rPr>
+          <w:rFonts w:ascii="Arial" w:cs="Arial" w:eastAsia="Arial" w:hAnsi="Arial"/>
+          <w:b/>
+          <w:bCs/>
+          <w:color w:val="1F4E79"/>
+        </w:rPr>
+        <w:t xml:space="preserve">[1:15]	</w:t>
+      </w:r>
       <w:r>
         <w:rPr>
           <w:rFonts w:ascii="Arial" w:cs="Arial" w:eastAsia="Arial" w:hAnsi="Arial"/>
@@ -267,7 +413,17 @@
     <w:p>
       <w:pPr>
         <w:spacing w:after="200"/>
-      </w:pPr>
+        <w:ind w:left="900" w:hanging="900"/>
+      </w:pPr>
+      <w:r>
+        <w:rPr>
+          <w:rFonts w:ascii="Arial" w:cs="Arial" w:eastAsia="Arial" w:hAnsi="Arial"/>
+          <w:b/>
+          <w:bCs/>
+          <w:color w:val="1F4E79"/>
+        </w:rPr>
+        <w:t xml:space="preserve">[1:32]	</w:t>
+      </w:r>
       <w:r>
         <w:rPr>
           <w:rFonts w:ascii="Arial" w:cs="Arial" w:eastAsia="Arial" w:hAnsi="Arial"/>
@@ -286,7 +442,17 @@
     <w:p>
       <w:pPr>
         <w:spacing w:after="200"/>
-      </w:pPr>
+        <w:ind w:left="900" w:hanging="900"/>
+      </w:pPr>
+      <w:r>
+        <w:rPr>
+          <w:rFonts w:ascii="Arial" w:cs="Arial" w:eastAsia="Arial" w:hAnsi="Arial"/>
+          <w:b/>
+          <w:bCs/>
+          <w:color w:val="1F4E79"/>
+        </w:rPr>
+        <w:t xml:space="preserve">[1:41]	</w:t>
+      </w:r>
       <w:r>
         <w:rPr>
           <w:rFonts w:ascii="Arial" w:cs="Arial" w:eastAsia="Arial" w:hAnsi="Arial"/>
@@ -305,7 +471,17 @@
     <w:p>
       <w:pPr>
         <w:spacing w:after="200"/>
-      </w:pPr>
+        <w:ind w:left="900" w:hanging="900"/>
+      </w:pPr>
+      <w:r>
+        <w:rPr>
+          <w:rFonts w:ascii="Arial" w:cs="Arial" w:eastAsia="Arial" w:hAnsi="Arial"/>
+          <w:b/>
+          <w:bCs/>
+          <w:color w:val="1F4E79"/>
+        </w:rPr>
+        <w:t xml:space="preserve">[1:48]	</w:t>
+      </w:r>
       <w:r>
         <w:rPr>
           <w:rFonts w:ascii="Arial" w:cs="Arial" w:eastAsia="Arial" w:hAnsi="Arial"/>
@@ -324,7 +500,17 @@
     <w:p>
       <w:pPr>
         <w:spacing w:after="200"/>
-      </w:pPr>
+        <w:ind w:left="900" w:hanging="900"/>
+      </w:pPr>
+      <w:r>
+        <w:rPr>
+          <w:rFonts w:ascii="Arial" w:cs="Arial" w:eastAsia="Arial" w:hAnsi="Arial"/>
+          <w:b/>
+          <w:bCs/>
+          <w:color w:val="1F4E79"/>
+        </w:rPr>
+        <w:t xml:space="preserve">[1:54]	</w:t>
+      </w:r>
       <w:r>
         <w:rPr>
           <w:rFonts w:ascii="Arial" w:cs="Arial" w:eastAsia="Arial" w:hAnsi="Arial"/>
@@ -343,7 +529,17 @@
     <w:p>
       <w:pPr>
         <w:spacing w:after="200"/>
-      </w:pPr>
+        <w:ind w:left="900" w:hanging="900"/>
+      </w:pPr>
+      <w:r>
+        <w:rPr>
+          <w:rFonts w:ascii="Arial" w:cs="Arial" w:eastAsia="Arial" w:hAnsi="Arial"/>
+          <w:b/>
+          <w:bCs/>
+          <w:color w:val="1F4E79"/>
+        </w:rPr>
+        <w:t xml:space="preserve">[2:05]	</w:t>
+      </w:r>
       <w:r>
         <w:rPr>
           <w:rFonts w:ascii="Arial" w:cs="Arial" w:eastAsia="Arial" w:hAnsi="Arial"/>
@@ -362,7 +558,17 @@
     <w:p>
       <w:pPr>
         <w:spacing w:after="200"/>
-      </w:pPr>
+        <w:ind w:left="900" w:hanging="900"/>
+      </w:pPr>
+      <w:r>
+        <w:rPr>
+          <w:rFonts w:ascii="Arial" w:cs="Arial" w:eastAsia="Arial" w:hAnsi="Arial"/>
+          <w:b/>
+          <w:bCs/>
+          <w:color w:val="1F4E79"/>
+        </w:rPr>
+        <w:t xml:space="preserve">[2:17]	</w:t>
+      </w:r>
       <w:r>
         <w:rPr>
           <w:rFonts w:ascii="Arial" w:cs="Arial" w:eastAsia="Arial" w:hAnsi="Arial"/>
@@ -381,7 +587,17 @@
     <w:p>
       <w:pPr>
         <w:spacing w:after="200"/>
-      </w:pPr>
+        <w:ind w:left="900" w:hanging="900"/>
+      </w:pPr>
+      <w:r>
+        <w:rPr>
+          <w:rFonts w:ascii="Arial" w:cs="Arial" w:eastAsia="Arial" w:hAnsi="Arial"/>
+          <w:b/>
+          <w:bCs/>
+          <w:color w:val="1F4E79"/>
+        </w:rPr>
+        <w:t xml:space="preserve">[2:19]	</w:t>
+      </w:r>
       <w:r>
         <w:rPr>
           <w:rFonts w:ascii="Arial" w:cs="Arial" w:eastAsia="Arial" w:hAnsi="Arial"/>
@@ -400,7 +616,17 @@
     <w:p>
       <w:pPr>
         <w:spacing w:after="200"/>
-      </w:pPr>
+        <w:ind w:left="900" w:hanging="900"/>
+      </w:pPr>
+      <w:r>
+        <w:rPr>
+          <w:rFonts w:ascii="Arial" w:cs="Arial" w:eastAsia="Arial" w:hAnsi="Arial"/>
+          <w:b/>
+          <w:bCs/>
+          <w:color w:val="1F4E79"/>
+        </w:rPr>
+        <w:t xml:space="preserve">[2:26]	</w:t>
+      </w:r>
       <w:r>
         <w:rPr>
           <w:rFonts w:ascii="Arial" w:cs="Arial" w:eastAsia="Arial" w:hAnsi="Arial"/>
@@ -419,7 +645,17 @@
     <w:p>
       <w:pPr>
         <w:spacing w:after="200"/>
-      </w:pPr>
+        <w:ind w:left="900" w:hanging="900"/>
+      </w:pPr>
+      <w:r>
+        <w:rPr>
+          <w:rFonts w:ascii="Arial" w:cs="Arial" w:eastAsia="Arial" w:hAnsi="Arial"/>
+          <w:b/>
+          <w:bCs/>
+          <w:color w:val="1F4E79"/>
+        </w:rPr>
+        <w:t xml:space="preserve">[2:29]	</w:t>
+      </w:r>
       <w:r>
         <w:rPr>
           <w:rFonts w:ascii="Arial" w:cs="Arial" w:eastAsia="Arial" w:hAnsi="Arial"/>
@@ -438,7 +674,17 @@
     <w:p>
       <w:pPr>
         <w:spacing w:after="200"/>
-      </w:pPr>
+        <w:ind w:left="900" w:hanging="900"/>
+      </w:pPr>
+      <w:r>
+        <w:rPr>
+          <w:rFonts w:ascii="Arial" w:cs="Arial" w:eastAsia="Arial" w:hAnsi="Arial"/>
+          <w:b/>
+          <w:bCs/>
+          <w:color w:val="1F4E79"/>
+        </w:rPr>
+        <w:t xml:space="preserve">[2:35]	</w:t>
+      </w:r>
       <w:r>
         <w:rPr>
           <w:rFonts w:ascii="Arial" w:cs="Arial" w:eastAsia="Arial" w:hAnsi="Arial"/>
@@ -457,7 +703,17 @@
     <w:p>
       <w:pPr>
         <w:spacing w:after="200"/>
-      </w:pPr>
+        <w:ind w:left="900" w:hanging="900"/>
+      </w:pPr>
+      <w:r>
+        <w:rPr>
+          <w:rFonts w:ascii="Arial" w:cs="Arial" w:eastAsia="Arial" w:hAnsi="Arial"/>
+          <w:b/>
+          <w:bCs/>
+          <w:color w:val="1F4E79"/>
+        </w:rPr>
+        <w:t xml:space="preserve">[2:37]	</w:t>
+      </w:r>
       <w:r>
         <w:rPr>
           <w:rFonts w:ascii="Arial" w:cs="Arial" w:eastAsia="Arial" w:hAnsi="Arial"/>
@@ -476,7 +732,17 @@
     <w:p>
       <w:pPr>
         <w:spacing w:after="200"/>
-      </w:pPr>
+        <w:ind w:left="900" w:hanging="900"/>
+      </w:pPr>
+      <w:r>
+        <w:rPr>
+          <w:rFonts w:ascii="Arial" w:cs="Arial" w:eastAsia="Arial" w:hAnsi="Arial"/>
+          <w:b/>
+          <w:bCs/>
+          <w:color w:val="1F4E79"/>
+        </w:rPr>
+        <w:t xml:space="preserve">[2:45]	</w:t>
+      </w:r>
       <w:r>
         <w:rPr>
           <w:rFonts w:ascii="Arial" w:cs="Arial" w:eastAsia="Arial" w:hAnsi="Arial"/>
@@ -495,7 +761,17 @@
     <w:p>
       <w:pPr>
         <w:spacing w:after="200"/>
-      </w:pPr>
+        <w:ind w:left="900" w:hanging="900"/>
+      </w:pPr>
+      <w:r>
+        <w:rPr>
+          <w:rFonts w:ascii="Arial" w:cs="Arial" w:eastAsia="Arial" w:hAnsi="Arial"/>
+          <w:b/>
+          <w:bCs/>
+          <w:color w:val="1F4E79"/>
+        </w:rPr>
+        <w:t xml:space="preserve">[2:50]	</w:t>
+      </w:r>
       <w:r>
         <w:rPr>
           <w:rFonts w:ascii="Arial" w:cs="Arial" w:eastAsia="Arial" w:hAnsi="Arial"/>
@@ -514,7 +790,17 @@
     <w:p>
       <w:pPr>
         <w:spacing w:after="200"/>
-      </w:pPr>
+        <w:ind w:left="900" w:hanging="900"/>
+      </w:pPr>
+      <w:r>
+        <w:rPr>
+          <w:rFonts w:ascii="Arial" w:cs="Arial" w:eastAsia="Arial" w:hAnsi="Arial"/>
+          <w:b/>
+          <w:bCs/>
+          <w:color w:val="1F4E79"/>
+        </w:rPr>
+        <w:t xml:space="preserve">[2:57]	</w:t>
+      </w:r>
       <w:r>
         <w:rPr>
           <w:rFonts w:ascii="Arial" w:cs="Arial" w:eastAsia="Arial" w:hAnsi="Arial"/>
@@ -533,7 +819,17 @@
     <w:p>
       <w:pPr>
         <w:spacing w:after="200"/>
-      </w:pPr>
+        <w:ind w:left="900" w:hanging="900"/>
+      </w:pPr>
+      <w:r>
+        <w:rPr>
+          <w:rFonts w:ascii="Arial" w:cs="Arial" w:eastAsia="Arial" w:hAnsi="Arial"/>
+          <w:b/>
+          <w:bCs/>
+          <w:color w:val="1F4E79"/>
+        </w:rPr>
+        <w:t xml:space="preserve">[3:00]	</w:t>
+      </w:r>
       <w:r>
         <w:rPr>
           <w:rFonts w:ascii="Arial" w:cs="Arial" w:eastAsia="Arial" w:hAnsi="Arial"/>

</xml_diff>

<commit_message>
Script vidéo 1 : étape 6 reformulée (boulons longs, espaceur)
Nouvelle formulation du client pour les deux répliques de l'étape 6 (desserrer les boulons longs un à la fois, retirer
l'espaceur, resserrer complètement sans l'espaceur ; espace requis pour desserrer les 6 autres boulons, sécurité
supplémentaire avec les 3 boulons longs en place), relue (procédure, langue). A/script-v2.json : script à enregistrer ;
A/script.json reste le texte de l'audio actuel (sert à l'alignement). Document Word mis à jour.

Co-Authored-By: Claude Opus 5.5 <noreply@anthropic.com>
Claude-Session: https://claude.ai/code/session_016YnqtNNUyZYY3JuA5BfKCG
</commit_message>
<xml_diff>
--- a/video/Script_PRO-OP-DD-005.docx
+++ b/video/Script_PRO-OP-DD-005.docx
@@ -437,7 +437,7 @@
         <w:rPr>
           <w:rFonts w:ascii="Arial" w:cs="Arial" w:eastAsia="Arial" w:hAnsi="Arial"/>
         </w:rPr>
-        <w:t xml:space="preserve">Étape six, c'est la clé de toute la job : on remet les trois boulons longs, les bolts, sans bushing.</w:t>
+        <w:t xml:space="preserve">Étape six, c'est la clé de toute la job. Il est important de desserrer les boulons longs un à la fois, de retirer l'espaceur, le bushing, pis de resserrer complètement le boulon sans l'espaceur.</w:t>
       </w:r>
     </w:p>
     <w:p>
@@ -471,7 +471,7 @@
         <w:rPr>
           <w:rFonts w:ascii="Arial" w:cs="Arial" w:eastAsia="Arial" w:hAnsi="Arial"/>
         </w:rPr>
-        <w:t xml:space="preserve">Sans bushing, ils vissent un pouce et demi plus loin. Assez de filets en prise pour retenir le cône si jamais il part.</w:t>
+        <w:t xml:space="preserve">Ça nous permet d'avoir l'espace requis pour desserrer les six autres boulons, tout en enlevant la tension des ressorts. Pis on garde une sécurité supplémentaire avec les trois boulons longs toujours en place.</w:t>
       </w:r>
     </w:p>
     <w:p>

</xml_diff>

<commit_message>
Script vidéo 1 : énergie résiduelle approfondie
Ajouts relus (exactitude SST, langue) : définition de l'énergie résiduelle à l'étape 1 (coupe des ressorts), son
contrôle à l'étape 3 (retenue à l'étape 6, relâchement à l'étape 7) et une question de l'équipe sur ses autres formes
(pression hydraulique, pièce qui peut tomber, câble tendu). A/script-v2.json passe à 30 répliques ; le champ
a_enregistrer marque le texte pas encore enregistré. Document Word : ce texte est surligné, les nouvelles répliques
sont marquées « nouveau ».

Co-Authored-By: Claude Opus 5.5 <noreply@anthropic.com>
Claude-Session: https://claude.ai/code/session_016YnqtNNUyZYY3JuA5BfKCG
</commit_message>
<xml_diff>
--- a/video/Script_PRO-OP-DD-005.docx
+++ b/video/Script_PRO-OP-DD-005.docx
@@ -30,7 +30,30 @@
           <w:sz w:val="20"/>
           <w:szCs w:val="20"/>
         </w:rPr>
-        <w:t xml:space="preserve">Le temps entre crochets indique où la réplique commence dans la vidéo (3 min 06 s).</w:t>
+        <w:t xml:space="preserve">Le temps entre crochets indique où la réplique commence dans la vidéo actuelle (3 min 06 s). </w:t>
+      </w:r>
+      <w:r>
+        <w:rPr>
+          <w:rFonts w:ascii="Arial" w:cs="Arial" w:eastAsia="Arial" w:hAnsi="Arial"/>
+          <w:i/>
+          <w:iCs/>
+          <w:color w:val="595959"/>
+          <w:sz w:val="20"/>
+          <w:szCs w:val="20"/>
+          <w:shd w:fill="FFE97F" w:color="auto" w:val="clear"/>
+        </w:rPr>
+        <w:t xml:space="preserve">Texte surligné</w:t>
+      </w:r>
+      <w:r>
+        <w:rPr>
+          <w:rFonts w:ascii="Arial" w:cs="Arial" w:eastAsia="Arial" w:hAnsi="Arial"/>
+          <w:i/>
+          <w:iCs/>
+          <w:color w:val="595959"/>
+          <w:sz w:val="20"/>
+          <w:szCs w:val="20"/>
+        </w:rPr>
+        <w:t xml:space="preserve"> : nouveau ou modifié, à enregistrer (pas encore dans la vidéo ; les temps seront mis à jour après le montage).</w:t>
       </w:r>
     </w:p>
     <w:p>
@@ -267,7 +290,14 @@
         <w:rPr>
           <w:rFonts w:ascii="Arial" w:cs="Arial" w:eastAsia="Arial" w:hAnsi="Arial"/>
         </w:rPr>
-        <w:t xml:space="preserve">Regardez la coupe : l'hydraulique est coupé, mais les ressorts verts sont encore comprimés. Fermer les manettes ne libère pas leur énergie.</w:t>
+        <w:t xml:space="preserve">Regardez la coupe : l'hydraulique est coupé, mais les ressorts verts sont encore comprimés. Fermer les manettes ne libère pas leur énergie. </w:t>
+      </w:r>
+      <w:r>
+        <w:rPr>
+          <w:rFonts w:ascii="Arial" w:cs="Arial" w:eastAsia="Arial" w:hAnsi="Arial"/>
+          <w:shd w:fill="FFE97F" w:color="auto" w:val="clear"/>
+        </w:rPr>
+        <w:t xml:space="preserve">C'est ce qu'on appelle de l'énergie résiduelle : elle reste emmagasinée dans l'équipement, même quand la source est arrêtée.</w:t>
       </w:r>
     </w:p>
     <w:p>
@@ -335,7 +365,14 @@
         <w:rPr>
           <w:rFonts w:ascii="Arial" w:cs="Arial" w:eastAsia="Arial" w:hAnsi="Arial"/>
         </w:rPr>
-        <w:t xml:space="preserve">Étape trois : on cadenasse la foreuse. Le cadenas empêche de repartir l'hydraulique, mais les ressorts, eux, poussent encore.</w:t>
+        <w:t xml:space="preserve">Étape trois : on cadenasse la foreuse. Le cadenas empêche de repartir l'hydraulique, mais les ressorts, eux, poussent encore. </w:t>
+      </w:r>
+      <w:r>
+        <w:rPr>
+          <w:rFonts w:ascii="Arial" w:cs="Arial" w:eastAsia="Arial" w:hAnsi="Arial"/>
+          <w:shd w:fill="FFE97F" w:color="auto" w:val="clear"/>
+        </w:rPr>
+        <w:t xml:space="preserve">Cette énergie résiduelle, on la contrôle aussi : on la retient à l'étape six, pis on la relâche tranquillement à l'étape sept.</w:t>
       </w:r>
     </w:p>
     <w:p>
@@ -436,6 +473,7 @@
       <w:r>
         <w:rPr>
           <w:rFonts w:ascii="Arial" w:cs="Arial" w:eastAsia="Arial" w:hAnsi="Arial"/>
+          <w:shd w:fill="FFE97F" w:color="auto" w:val="clear"/>
         </w:rPr>
         <w:t xml:space="preserve">Étape six, c'est la clé de toute la job. Il est important de desserrer les boulons longs un à la fois, de retirer l'espaceur, qu'on appelle le bushing, pis de resserrer complètement le boulon sans bushing.</w:t>
       </w:r>
@@ -470,6 +508,7 @@
       <w:r>
         <w:rPr>
           <w:rFonts w:ascii="Arial" w:cs="Arial" w:eastAsia="Arial" w:hAnsi="Arial"/>
+          <w:shd w:fill="FFE97F" w:color="auto" w:val="clear"/>
         </w:rPr>
         <w:t xml:space="preserve">Ça nous permet d'avoir l'espace requis pour desserrer les six autres boulons, tout en enlevant la tension des ressorts. Pis on garde une sécurité supplémentaire avec les trois boulons longs toujours en place.</w:t>
       </w:r>
@@ -948,6 +987,76 @@
           <w:rFonts w:ascii="Arial" w:cs="Arial" w:eastAsia="Arial" w:hAnsi="Arial"/>
         </w:rPr>
         <w:t xml:space="preserve">Non. Ce sont eux qui retiennent le cône si quelque chose lâche. Sans eux, rien ne l'arrête.</w:t>
+      </w:r>
+    </w:p>
+    <w:p>
+      <w:pPr>
+        <w:pBdr>
+          <w:left w:val="single" w:color="C55A11" w:sz="24" w:space="6"/>
+        </w:pBdr>
+        <w:shd w:fill="FCE9DB" w:color="auto" w:val="clear"/>
+        <w:spacing w:before="60" w:after="140"/>
+        <w:ind w:left="120" w:right="120"/>
+      </w:pPr>
+      <w:r>
+        <w:rPr>
+          <w:rFonts w:ascii="Arial" w:cs="Arial" w:eastAsia="Arial" w:hAnsi="Arial"/>
+          <w:b/>
+          <w:bCs/>
+          <w:color w:val="595959"/>
+        </w:rPr>
+        <w:t xml:space="preserve">[nouveau]  </w:t>
+      </w:r>
+      <w:r>
+        <w:rPr>
+          <w:rFonts w:ascii="Arial" w:cs="Arial" w:eastAsia="Arial" w:hAnsi="Arial"/>
+          <w:b/>
+          <w:bCs/>
+          <w:color w:val="C55A11"/>
+        </w:rPr>
+        <w:t xml:space="preserve">Travailleur : </w:t>
+      </w:r>
+      <w:r>
+        <w:rPr>
+          <w:rFonts w:ascii="Arial" w:cs="Arial" w:eastAsia="Arial" w:hAnsi="Arial"/>
+          <w:shd w:fill="FFE97F" w:color="auto" w:val="clear"/>
+        </w:rPr>
+        <w:t xml:space="preserve">L'énergie résiduelle, y en a juste dans les ressorts ?</w:t>
+      </w:r>
+    </w:p>
+    <w:p>
+      <w:pPr>
+        <w:pBdr>
+          <w:left w:val="single" w:color="1F4E79" w:sz="24" w:space="6"/>
+        </w:pBdr>
+        <w:shd w:fill="E9F1FA" w:color="auto" w:val="clear"/>
+        <w:spacing w:before="60" w:after="140"/>
+        <w:ind w:left="120" w:right="120"/>
+      </w:pPr>
+      <w:r>
+        <w:rPr>
+          <w:rFonts w:ascii="Arial" w:cs="Arial" w:eastAsia="Arial" w:hAnsi="Arial"/>
+          <w:b/>
+          <w:bCs/>
+          <w:color w:val="595959"/>
+        </w:rPr>
+        <w:t xml:space="preserve">[nouveau]  </w:t>
+      </w:r>
+      <w:r>
+        <w:rPr>
+          <w:rFonts w:ascii="Arial" w:cs="Arial" w:eastAsia="Arial" w:hAnsi="Arial"/>
+          <w:b/>
+          <w:bCs/>
+          <w:color w:val="1F4E79"/>
+        </w:rPr>
+        <w:t xml:space="preserve">Formateur : </w:t>
+      </w:r>
+      <w:r>
+        <w:rPr>
+          <w:rFonts w:ascii="Arial" w:cs="Arial" w:eastAsia="Arial" w:hAnsi="Arial"/>
+          <w:shd w:fill="FFE97F" w:color="auto" w:val="clear"/>
+        </w:rPr>
+        <w:t xml:space="preserve">Pas juste là. Il y a aussi la pression qui reste dans les boyaux hydrauliques, une pièce qui peut tomber, un câble tendu. Avant de démonter, on se demande toujours : qu'est-ce qui peut encore bouger ?</w:t>
       </w:r>
     </w:p>
     <w:p>

</xml_diff>

<commit_message>
Annule « Script vidéo 1 : énergie résiduelle approfondie » (en attente de validation)
Les ajouts sur l'énergie résiduelle restent une proposition, à valider par le client avant d'entrer dans le script.

Co-Authored-By: Claude Opus 5.5 <noreply@anthropic.com>
Claude-Session: https://claude.ai/code/session_016YnqtNNUyZYY3JuA5BfKCG
</commit_message>
<xml_diff>
--- a/video/Script_PRO-OP-DD-005.docx
+++ b/video/Script_PRO-OP-DD-005.docx
@@ -30,30 +30,7 @@
           <w:sz w:val="20"/>
           <w:szCs w:val="20"/>
         </w:rPr>
-        <w:t xml:space="preserve">Le temps entre crochets indique où la réplique commence dans la vidéo actuelle (3 min 06 s). </w:t>
-      </w:r>
-      <w:r>
-        <w:rPr>
-          <w:rFonts w:ascii="Arial" w:cs="Arial" w:eastAsia="Arial" w:hAnsi="Arial"/>
-          <w:i/>
-          <w:iCs/>
-          <w:color w:val="595959"/>
-          <w:sz w:val="20"/>
-          <w:szCs w:val="20"/>
-          <w:shd w:fill="FFE97F" w:color="auto" w:val="clear"/>
-        </w:rPr>
-        <w:t xml:space="preserve">Texte surligné</w:t>
-      </w:r>
-      <w:r>
-        <w:rPr>
-          <w:rFonts w:ascii="Arial" w:cs="Arial" w:eastAsia="Arial" w:hAnsi="Arial"/>
-          <w:i/>
-          <w:iCs/>
-          <w:color w:val="595959"/>
-          <w:sz w:val="20"/>
-          <w:szCs w:val="20"/>
-        </w:rPr>
-        <w:t xml:space="preserve"> : nouveau ou modifié, à enregistrer (pas encore dans la vidéo ; les temps seront mis à jour après le montage).</w:t>
+        <w:t xml:space="preserve">Le temps entre crochets indique où la réplique commence dans la vidéo (3 min 06 s).</w:t>
       </w:r>
     </w:p>
     <w:p>
@@ -290,14 +267,7 @@
         <w:rPr>
           <w:rFonts w:ascii="Arial" w:cs="Arial" w:eastAsia="Arial" w:hAnsi="Arial"/>
         </w:rPr>
-        <w:t xml:space="preserve">Regardez la coupe : l'hydraulique est coupé, mais les ressorts verts sont encore comprimés. Fermer les manettes ne libère pas leur énergie. </w:t>
-      </w:r>
-      <w:r>
-        <w:rPr>
-          <w:rFonts w:ascii="Arial" w:cs="Arial" w:eastAsia="Arial" w:hAnsi="Arial"/>
-          <w:shd w:fill="FFE97F" w:color="auto" w:val="clear"/>
-        </w:rPr>
-        <w:t xml:space="preserve">C'est ce qu'on appelle de l'énergie résiduelle : elle reste emmagasinée dans l'équipement, même quand la source est arrêtée.</w:t>
+        <w:t xml:space="preserve">Regardez la coupe : l'hydraulique est coupé, mais les ressorts verts sont encore comprimés. Fermer les manettes ne libère pas leur énergie.</w:t>
       </w:r>
     </w:p>
     <w:p>
@@ -365,14 +335,7 @@
         <w:rPr>
           <w:rFonts w:ascii="Arial" w:cs="Arial" w:eastAsia="Arial" w:hAnsi="Arial"/>
         </w:rPr>
-        <w:t xml:space="preserve">Étape trois : on cadenasse la foreuse. Le cadenas empêche de repartir l'hydraulique, mais les ressorts, eux, poussent encore. </w:t>
-      </w:r>
-      <w:r>
-        <w:rPr>
-          <w:rFonts w:ascii="Arial" w:cs="Arial" w:eastAsia="Arial" w:hAnsi="Arial"/>
-          <w:shd w:fill="FFE97F" w:color="auto" w:val="clear"/>
-        </w:rPr>
-        <w:t xml:space="preserve">Cette énergie résiduelle, on la contrôle aussi : on la retient à l'étape six, pis on la relâche tranquillement à l'étape sept.</w:t>
+        <w:t xml:space="preserve">Étape trois : on cadenasse la foreuse. Le cadenas empêche de repartir l'hydraulique, mais les ressorts, eux, poussent encore.</w:t>
       </w:r>
     </w:p>
     <w:p>
@@ -473,7 +436,6 @@
       <w:r>
         <w:rPr>
           <w:rFonts w:ascii="Arial" w:cs="Arial" w:eastAsia="Arial" w:hAnsi="Arial"/>
-          <w:shd w:fill="FFE97F" w:color="auto" w:val="clear"/>
         </w:rPr>
         <w:t xml:space="preserve">Étape six, c'est la clé de toute la job. Il est important de desserrer les boulons longs un à la fois, de retirer l'espaceur, qu'on appelle le bushing, pis de resserrer complètement le boulon sans bushing.</w:t>
       </w:r>
@@ -508,7 +470,6 @@
       <w:r>
         <w:rPr>
           <w:rFonts w:ascii="Arial" w:cs="Arial" w:eastAsia="Arial" w:hAnsi="Arial"/>
-          <w:shd w:fill="FFE97F" w:color="auto" w:val="clear"/>
         </w:rPr>
         <w:t xml:space="preserve">Ça nous permet d'avoir l'espace requis pour desserrer les six autres boulons, tout en enlevant la tension des ressorts. Pis on garde une sécurité supplémentaire avec les trois boulons longs toujours en place.</w:t>
       </w:r>
@@ -987,76 +948,6 @@
           <w:rFonts w:ascii="Arial" w:cs="Arial" w:eastAsia="Arial" w:hAnsi="Arial"/>
         </w:rPr>
         <w:t xml:space="preserve">Non. Ce sont eux qui retiennent le cône si quelque chose lâche. Sans eux, rien ne l'arrête.</w:t>
-      </w:r>
-    </w:p>
-    <w:p>
-      <w:pPr>
-        <w:pBdr>
-          <w:left w:val="single" w:color="C55A11" w:sz="24" w:space="6"/>
-        </w:pBdr>
-        <w:shd w:fill="FCE9DB" w:color="auto" w:val="clear"/>
-        <w:spacing w:before="60" w:after="140"/>
-        <w:ind w:left="120" w:right="120"/>
-      </w:pPr>
-      <w:r>
-        <w:rPr>
-          <w:rFonts w:ascii="Arial" w:cs="Arial" w:eastAsia="Arial" w:hAnsi="Arial"/>
-          <w:b/>
-          <w:bCs/>
-          <w:color w:val="595959"/>
-        </w:rPr>
-        <w:t xml:space="preserve">[nouveau]  </w:t>
-      </w:r>
-      <w:r>
-        <w:rPr>
-          <w:rFonts w:ascii="Arial" w:cs="Arial" w:eastAsia="Arial" w:hAnsi="Arial"/>
-          <w:b/>
-          <w:bCs/>
-          <w:color w:val="C55A11"/>
-        </w:rPr>
-        <w:t xml:space="preserve">Travailleur : </w:t>
-      </w:r>
-      <w:r>
-        <w:rPr>
-          <w:rFonts w:ascii="Arial" w:cs="Arial" w:eastAsia="Arial" w:hAnsi="Arial"/>
-          <w:shd w:fill="FFE97F" w:color="auto" w:val="clear"/>
-        </w:rPr>
-        <w:t xml:space="preserve">L'énergie résiduelle, y en a juste dans les ressorts ?</w:t>
-      </w:r>
-    </w:p>
-    <w:p>
-      <w:pPr>
-        <w:pBdr>
-          <w:left w:val="single" w:color="1F4E79" w:sz="24" w:space="6"/>
-        </w:pBdr>
-        <w:shd w:fill="E9F1FA" w:color="auto" w:val="clear"/>
-        <w:spacing w:before="60" w:after="140"/>
-        <w:ind w:left="120" w:right="120"/>
-      </w:pPr>
-      <w:r>
-        <w:rPr>
-          <w:rFonts w:ascii="Arial" w:cs="Arial" w:eastAsia="Arial" w:hAnsi="Arial"/>
-          <w:b/>
-          <w:bCs/>
-          <w:color w:val="595959"/>
-        </w:rPr>
-        <w:t xml:space="preserve">[nouveau]  </w:t>
-      </w:r>
-      <w:r>
-        <w:rPr>
-          <w:rFonts w:ascii="Arial" w:cs="Arial" w:eastAsia="Arial" w:hAnsi="Arial"/>
-          <w:b/>
-          <w:bCs/>
-          <w:color w:val="1F4E79"/>
-        </w:rPr>
-        <w:t xml:space="preserve">Formateur : </w:t>
-      </w:r>
-      <w:r>
-        <w:rPr>
-          <w:rFonts w:ascii="Arial" w:cs="Arial" w:eastAsia="Arial" w:hAnsi="Arial"/>
-          <w:shd w:fill="FFE97F" w:color="auto" w:val="clear"/>
-        </w:rPr>
-        <w:t xml:space="preserve">Pas juste là. Il y a aussi la pression qui reste dans les boyaux hydrauliques, une pièce qui peut tomber, un câble tendu. Avant de démonter, on se demande toujours : qu'est-ce qui peut encore bouger ?</w:t>
       </w:r>
     </w:p>
     <w:p>

</xml_diff>

<commit_message>
Script vidéo 1 : énergie résiduelle aux étapes 1 et 3 (validé par le client)
Étape 1 : définition de l'énergie résiduelle sur la coupe des ressorts ; étape 3 : son contrôle (retenue à l'étape 6,
relâchement à l'étape 7). A/script-v2.json : champ a_enregistrer pour le texte pas encore enregistré, surligné dans
le document Word.

Co-Authored-By: Claude Opus 5.5 <noreply@anthropic.com>
Claude-Session: https://claude.ai/code/session_016YnqtNNUyZYY3JuA5BfKCG
</commit_message>
<xml_diff>
--- a/video/Script_PRO-OP-DD-005.docx
+++ b/video/Script_PRO-OP-DD-005.docx
@@ -30,7 +30,30 @@
           <w:sz w:val="20"/>
           <w:szCs w:val="20"/>
         </w:rPr>
-        <w:t xml:space="preserve">Le temps entre crochets indique où la réplique commence dans la vidéo (3 min 06 s).</w:t>
+        <w:t xml:space="preserve">Le temps entre crochets indique où la réplique commence dans la vidéo actuelle (3 min 06 s). </w:t>
+      </w:r>
+      <w:r>
+        <w:rPr>
+          <w:rFonts w:ascii="Arial" w:cs="Arial" w:eastAsia="Arial" w:hAnsi="Arial"/>
+          <w:i/>
+          <w:iCs/>
+          <w:color w:val="595959"/>
+          <w:sz w:val="20"/>
+          <w:szCs w:val="20"/>
+          <w:shd w:fill="FFE97F" w:color="auto" w:val="clear"/>
+        </w:rPr>
+        <w:t xml:space="preserve">Texte surligné</w:t>
+      </w:r>
+      <w:r>
+        <w:rPr>
+          <w:rFonts w:ascii="Arial" w:cs="Arial" w:eastAsia="Arial" w:hAnsi="Arial"/>
+          <w:i/>
+          <w:iCs/>
+          <w:color w:val="595959"/>
+          <w:sz w:val="20"/>
+          <w:szCs w:val="20"/>
+        </w:rPr>
+        <w:t xml:space="preserve"> : nouveau ou modifié, à enregistrer (pas encore dans la vidéo ; les temps seront mis à jour après le montage).</w:t>
       </w:r>
     </w:p>
     <w:p>
@@ -267,7 +290,14 @@
         <w:rPr>
           <w:rFonts w:ascii="Arial" w:cs="Arial" w:eastAsia="Arial" w:hAnsi="Arial"/>
         </w:rPr>
-        <w:t xml:space="preserve">Regardez la coupe : l'hydraulique est coupé, mais les ressorts verts sont encore comprimés. Fermer les manettes ne libère pas leur énergie.</w:t>
+        <w:t xml:space="preserve">Regardez la coupe : l'hydraulique est coupé, mais les ressorts verts sont encore comprimés. Fermer les manettes ne libère pas leur énergie. </w:t>
+      </w:r>
+      <w:r>
+        <w:rPr>
+          <w:rFonts w:ascii="Arial" w:cs="Arial" w:eastAsia="Arial" w:hAnsi="Arial"/>
+          <w:shd w:fill="FFE97F" w:color="auto" w:val="clear"/>
+        </w:rPr>
+        <w:t xml:space="preserve">C'est ce qu'on appelle de l'énergie résiduelle : elle reste emmagasinée dans l'équipement, même quand la source est arrêtée.</w:t>
       </w:r>
     </w:p>
     <w:p>
@@ -335,7 +365,14 @@
         <w:rPr>
           <w:rFonts w:ascii="Arial" w:cs="Arial" w:eastAsia="Arial" w:hAnsi="Arial"/>
         </w:rPr>
-        <w:t xml:space="preserve">Étape trois : on cadenasse la foreuse. Le cadenas empêche de repartir l'hydraulique, mais les ressorts, eux, poussent encore.</w:t>
+        <w:t xml:space="preserve">Étape trois : on cadenasse la foreuse. Le cadenas empêche de repartir l'hydraulique, mais les ressorts, eux, poussent encore. </w:t>
+      </w:r>
+      <w:r>
+        <w:rPr>
+          <w:rFonts w:ascii="Arial" w:cs="Arial" w:eastAsia="Arial" w:hAnsi="Arial"/>
+          <w:shd w:fill="FFE97F" w:color="auto" w:val="clear"/>
+        </w:rPr>
+        <w:t xml:space="preserve">Cette énergie résiduelle, on la contrôle aussi : on la retient à l'étape six, pis on la relâche tranquillement à l'étape sept.</w:t>
       </w:r>
     </w:p>
     <w:p>
@@ -436,6 +473,7 @@
       <w:r>
         <w:rPr>
           <w:rFonts w:ascii="Arial" w:cs="Arial" w:eastAsia="Arial" w:hAnsi="Arial"/>
+          <w:shd w:fill="FFE97F" w:color="auto" w:val="clear"/>
         </w:rPr>
         <w:t xml:space="preserve">Étape six, c'est la clé de toute la job. Il est important de desserrer les boulons longs un à la fois, de retirer l'espaceur, qu'on appelle le bushing, pis de resserrer complètement le boulon sans bushing.</w:t>
       </w:r>
@@ -470,6 +508,7 @@
       <w:r>
         <w:rPr>
           <w:rFonts w:ascii="Arial" w:cs="Arial" w:eastAsia="Arial" w:hAnsi="Arial"/>
+          <w:shd w:fill="FFE97F" w:color="auto" w:val="clear"/>
         </w:rPr>
         <w:t xml:space="preserve">Ça nous permet d'avoir l'espace requis pour desserrer les six autres boulons, tout en enlevant la tension des ressorts. Pis on garde une sécurité supplémentaire avec les trois boulons longs toujours en place.</w:t>
       </w:r>

</xml_diff>

<commit_message>
Script vidéo 1 : question de l'équipe sur les autres formes d'énergie résiduelle (validée)
Nouvelle question avant « Pis si quelque chose me semble pas normal ? » : pression des boyaux hydrauliques, pièce qui
peut tomber, câble tendu. A/script-v2.json passe à 30 répliques ; dans le document Word, les deux répliques sont
marquées « nouveau ».

Co-Authored-By: Claude Opus 5.5 <noreply@anthropic.com>
Claude-Session: https://claude.ai/code/session_016YnqtNNUyZYY3JuA5BfKCG
</commit_message>
<xml_diff>
--- a/video/Script_PRO-OP-DD-005.docx
+++ b/video/Script_PRO-OP-DD-005.docx
@@ -987,6 +987,76 @@
           <w:rFonts w:ascii="Arial" w:cs="Arial" w:eastAsia="Arial" w:hAnsi="Arial"/>
         </w:rPr>
         <w:t xml:space="preserve">Non. Ce sont eux qui retiennent le cône si quelque chose lâche. Sans eux, rien ne l'arrête.</w:t>
+      </w:r>
+    </w:p>
+    <w:p>
+      <w:pPr>
+        <w:pBdr>
+          <w:left w:val="single" w:color="C55A11" w:sz="24" w:space="6"/>
+        </w:pBdr>
+        <w:shd w:fill="FCE9DB" w:color="auto" w:val="clear"/>
+        <w:spacing w:before="60" w:after="140"/>
+        <w:ind w:left="120" w:right="120"/>
+      </w:pPr>
+      <w:r>
+        <w:rPr>
+          <w:rFonts w:ascii="Arial" w:cs="Arial" w:eastAsia="Arial" w:hAnsi="Arial"/>
+          <w:b/>
+          <w:bCs/>
+          <w:color w:val="595959"/>
+        </w:rPr>
+        <w:t xml:space="preserve">[nouveau]  </w:t>
+      </w:r>
+      <w:r>
+        <w:rPr>
+          <w:rFonts w:ascii="Arial" w:cs="Arial" w:eastAsia="Arial" w:hAnsi="Arial"/>
+          <w:b/>
+          <w:bCs/>
+          <w:color w:val="C55A11"/>
+        </w:rPr>
+        <w:t xml:space="preserve">Travailleur : </w:t>
+      </w:r>
+      <w:r>
+        <w:rPr>
+          <w:rFonts w:ascii="Arial" w:cs="Arial" w:eastAsia="Arial" w:hAnsi="Arial"/>
+          <w:shd w:fill="FFE97F" w:color="auto" w:val="clear"/>
+        </w:rPr>
+        <w:t xml:space="preserve">L'énergie résiduelle, y en a juste dans les ressorts ?</w:t>
+      </w:r>
+    </w:p>
+    <w:p>
+      <w:pPr>
+        <w:pBdr>
+          <w:left w:val="single" w:color="1F4E79" w:sz="24" w:space="6"/>
+        </w:pBdr>
+        <w:shd w:fill="E9F1FA" w:color="auto" w:val="clear"/>
+        <w:spacing w:before="60" w:after="140"/>
+        <w:ind w:left="120" w:right="120"/>
+      </w:pPr>
+      <w:r>
+        <w:rPr>
+          <w:rFonts w:ascii="Arial" w:cs="Arial" w:eastAsia="Arial" w:hAnsi="Arial"/>
+          <w:b/>
+          <w:bCs/>
+          <w:color w:val="595959"/>
+        </w:rPr>
+        <w:t xml:space="preserve">[nouveau]  </w:t>
+      </w:r>
+      <w:r>
+        <w:rPr>
+          <w:rFonts w:ascii="Arial" w:cs="Arial" w:eastAsia="Arial" w:hAnsi="Arial"/>
+          <w:b/>
+          <w:bCs/>
+          <w:color w:val="1F4E79"/>
+        </w:rPr>
+        <w:t xml:space="preserve">Formateur : </w:t>
+      </w:r>
+      <w:r>
+        <w:rPr>
+          <w:rFonts w:ascii="Arial" w:cs="Arial" w:eastAsia="Arial" w:hAnsi="Arial"/>
+          <w:shd w:fill="FFE97F" w:color="auto" w:val="clear"/>
+        </w:rPr>
+        <w:t xml:space="preserve">Pas juste là. Il y a aussi la pression qui reste dans les boyaux hydrauliques, une pièce qui peut tomber, un câble tendu. Avant de démonter, on se demande toujours : qu'est-ce qui peut encore bouger ?</w:t>
       </w:r>
     </w:p>
     <w:p>

</xml_diff>

<commit_message>
Vidéo 1 : carte d'arrêt après l'étape 1 (question à l'équipe, validée)
« Les ressorts sont encore comprimés. Selon vous, comment on peut relâcher cette énergie-là sans danger ? » : carte
plein écran sans voix, environ 8 s, pour mettre sur pause et discuter. A/arrets.json ; ajoutée au document Word.

Co-Authored-By: Claude Opus 5.5 <noreply@anthropic.com>
Claude-Session: https://claude.ai/code/session_016YnqtNNUyZYY3JuA5BfKCG
</commit_message>
<xml_diff>
--- a/video/Script_PRO-OP-DD-005.docx
+++ b/video/Script_PRO-OP-DD-005.docx
@@ -298,6 +298,50 @@
           <w:shd w:fill="FFE97F" w:color="auto" w:val="clear"/>
         </w:rPr>
         <w:t xml:space="preserve">C'est ce qu'on appelle de l'énergie résiduelle : elle reste emmagasinée dans l'équipement, même quand la source est arrêtée.</w:t>
+      </w:r>
+    </w:p>
+    <w:p>
+      <w:pPr>
+        <w:pBdr>
+          <w:left w:val="dashed" w:color="B7791F" w:sz="24" w:space="6"/>
+        </w:pBdr>
+        <w:shd w:fill="FFF8E1" w:color="auto" w:val="clear"/>
+        <w:spacing w:before="60" w:after="140"/>
+        <w:ind w:left="120" w:right="120"/>
+      </w:pPr>
+      <w:r>
+        <w:rPr>
+          <w:rFonts w:ascii="Arial" w:cs="Arial" w:eastAsia="Arial" w:hAnsi="Arial"/>
+          <w:b/>
+          <w:bCs/>
+          <w:color w:val="595959"/>
+        </w:rPr>
+        <w:t xml:space="preserve">[nouveau]  </w:t>
+      </w:r>
+      <w:r>
+        <w:rPr>
+          <w:rFonts w:ascii="Arial" w:cs="Arial" w:eastAsia="Arial" w:hAnsi="Arial"/>
+          <w:b/>
+          <w:bCs/>
+          <w:color w:val="8A5A00"/>
+        </w:rPr>
+        <w:t xml:space="preserve">⏸ ARRÊT — ON EN DISCUTE (carte à l’écran, sans voix) : </w:t>
+      </w:r>
+      <w:r>
+        <w:rPr>
+          <w:rFonts w:ascii="Arial" w:cs="Arial" w:eastAsia="Arial" w:hAnsi="Arial"/>
+          <w:shd w:fill="FFE97F" w:color="auto" w:val="clear"/>
+        </w:rPr>
+        <w:t xml:space="preserve">Les ressorts sont encore comprimés. Selon vous, comment on peut relâcher cette énergie-là sans danger ?</w:t>
+      </w:r>
+      <w:r>
+        <w:rPr>
+          <w:rFonts w:ascii="Arial" w:cs="Arial" w:eastAsia="Arial" w:hAnsi="Arial"/>
+          <w:i/>
+          <w:iCs/>
+          <w:color w:val="595959"/>
+        </w:rPr>
+        <w:t xml:space="preserve">  Mettez la vidéo sur pause et discutez en équipe.</w:t>
       </w:r>
     </w:p>
     <w:p>

</xml_diff>

<commit_message>
Vidéo 1, « À retenir » : « avant de desserrer les six autres boulons » au lieu de « avant l'étape sept » (validé)
Script (A/script-v2.json, à enregistrer), ligne 2 du carton « À retenir » en mode --synchro (suit la voix) et document
Word.

Co-Authored-By: Claude Opus 5.5 <noreply@anthropic.com>
Claude-Session: https://claude.ai/code/session_016YnqtNNUyZYY3JuA5BfKCG
</commit_message>
<xml_diff>
--- a/video/Script_PRO-OP-DD-005.docx
+++ b/video/Script_PRO-OP-DD-005.docx
@@ -758,7 +758,14 @@
         <w:rPr>
           <w:rFonts w:ascii="Arial" w:cs="Arial" w:eastAsia="Arial" w:hAnsi="Arial"/>
         </w:rPr>
-        <w:t xml:space="preserve">Pour le quart : jamais un boulon du cône enlevé au complet sous charge. Les trois boulons longs sans bushing, avant l'étape sept. Pis un tour à la fois.</w:t>
+        <w:t xml:space="preserve">Pour le quart : jamais un boulon du cône enlevé au complet sous charge. </w:t>
+      </w:r>
+      <w:r>
+        <w:rPr>
+          <w:rFonts w:ascii="Arial" w:cs="Arial" w:eastAsia="Arial" w:hAnsi="Arial"/>
+          <w:shd w:fill="FFE97F" w:color="auto" w:val="clear"/>
+        </w:rPr>
+        <w:t xml:space="preserve">Les trois boulons longs sans bushing, avant de desserrer les six autres boulons. Pis un tour à la fois.</w:t>
       </w:r>
     </w:p>
     <w:p>

</xml_diff>

<commit_message>
Vidéo 1, étape 7 : contre-exemple « si on ne respecte pas la séquence » (validé)
Après le « Pourquoi » de l'étape 7 : images du scénario « Sans les boulons longs : cône projeté », en rouge, sur une
nouvelle réplique du formateur (A_06_x : boulons sortis au complet un par un sans s'occuper de l'énergie résiduelle,
le dernier casse, le cône est projeté), puis retour à « La bonne méthode ». A/contre-exemple.json ; script-v2.json et
document Word mis à jour.

Co-Authored-By: Claude Opus 5.5 <noreply@anthropic.com>
Claude-Session: https://claude.ai/code/session_016YnqtNNUyZYY3JuA5BfKCG
</commit_message>
<xml_diff>
--- a/video/Script_PRO-OP-DD-005.docx
+++ b/video/Script_PRO-OP-DD-005.docx
@@ -623,6 +623,115 @@
           <w:rFonts w:ascii="Arial" w:cs="Arial" w:eastAsia="Arial" w:hAnsi="Arial"/>
         </w:rPr>
         <w:t xml:space="preserve">Les six boulons partagent la charge : les ressorts se détendent peu à peu, également. C'est plus long, mais on reste en contrôle.</w:t>
+      </w:r>
+    </w:p>
+    <w:p>
+      <w:pPr>
+        <w:pBdr>
+          <w:left w:val="dashed" w:color="C00000" w:sz="24" w:space="6"/>
+        </w:pBdr>
+        <w:shd w:fill="FDECEC" w:color="auto" w:val="clear"/>
+        <w:spacing w:before="60" w:after="140"/>
+        <w:ind w:left="120" w:right="120"/>
+      </w:pPr>
+      <w:r>
+        <w:rPr>
+          <w:rFonts w:ascii="Arial" w:cs="Arial" w:eastAsia="Arial" w:hAnsi="Arial"/>
+          <w:b/>
+          <w:bCs/>
+          <w:color w:val="595959"/>
+        </w:rPr>
+        <w:t xml:space="preserve">[nouveau]  </w:t>
+      </w:r>
+      <w:r>
+        <w:rPr>
+          <w:rFonts w:ascii="Arial" w:cs="Arial" w:eastAsia="Arial" w:hAnsi="Arial"/>
+          <w:b/>
+          <w:bCs/>
+          <w:color w:val="C00000"/>
+        </w:rPr>
+        <w:t xml:space="preserve">✗ SI ON NE RESPECTE PAS LA SÉQUENCE</w:t>
+      </w:r>
+      <w:r>
+        <w:rPr>
+          <w:rFonts w:ascii="Arial" w:cs="Arial" w:eastAsia="Arial" w:hAnsi="Arial"/>
+          <w:i/>
+          <w:iCs/>
+          <w:color w:val="595959"/>
+        </w:rPr>
+        <w:t xml:space="preserve"> — à l’écran, en rouge : boulons sortis au complet un par un, sans les boulons longs ; le dernier casse, le cône est projeté.</w:t>
+      </w:r>
+    </w:p>
+    <w:p>
+      <w:pPr>
+        <w:pBdr>
+          <w:left w:val="single" w:color="1F4E79" w:sz="24" w:space="6"/>
+        </w:pBdr>
+        <w:shd w:fill="E9F1FA" w:color="auto" w:val="clear"/>
+        <w:spacing w:before="60" w:after="140"/>
+        <w:ind w:left="120" w:right="120"/>
+      </w:pPr>
+      <w:r>
+        <w:rPr>
+          <w:rFonts w:ascii="Arial" w:cs="Arial" w:eastAsia="Arial" w:hAnsi="Arial"/>
+          <w:b/>
+          <w:bCs/>
+          <w:color w:val="595959"/>
+        </w:rPr>
+        <w:t xml:space="preserve">[nouveau]  </w:t>
+      </w:r>
+      <w:r>
+        <w:rPr>
+          <w:rFonts w:ascii="Arial" w:cs="Arial" w:eastAsia="Arial" w:hAnsi="Arial"/>
+          <w:b/>
+          <w:bCs/>
+          <w:color w:val="1F4E79"/>
+        </w:rPr>
+        <w:t xml:space="preserve">Formateur : </w:t>
+      </w:r>
+      <w:r>
+        <w:rPr>
+          <w:rFonts w:ascii="Arial" w:cs="Arial" w:eastAsia="Arial" w:hAnsi="Arial"/>
+          <w:shd w:fill="FFE97F" w:color="auto" w:val="clear"/>
+        </w:rPr>
+        <w:t xml:space="preserve">Regardez ce qui arrive si on sort les boulons au complet, un après l'autre, sans s'occuper de l'énergie résiduelle. Les ressorts restent comprimés, pis chaque boulon enlevé laisse plus de charge aux autres. Le dernier porte toute la force : il casse, pis le cône est projeté. C'est pour ça qu'on y va un tour à la fois.</w:t>
+      </w:r>
+    </w:p>
+    <w:p>
+      <w:pPr>
+        <w:pBdr>
+          <w:left w:val="dashed" w:color="2E7D32" w:sz="24" w:space="6"/>
+        </w:pBdr>
+        <w:shd w:fill="EAF5EA" w:color="auto" w:val="clear"/>
+        <w:spacing w:before="60" w:after="140"/>
+        <w:ind w:left="120" w:right="120"/>
+      </w:pPr>
+      <w:r>
+        <w:rPr>
+          <w:rFonts w:ascii="Arial" w:cs="Arial" w:eastAsia="Arial" w:hAnsi="Arial"/>
+          <w:b/>
+          <w:bCs/>
+          <w:color w:val="595959"/>
+        </w:rPr>
+        <w:t xml:space="preserve">[nouveau]  </w:t>
+      </w:r>
+      <w:r>
+        <w:rPr>
+          <w:rFonts w:ascii="Arial" w:cs="Arial" w:eastAsia="Arial" w:hAnsi="Arial"/>
+          <w:b/>
+          <w:bCs/>
+          <w:color w:val="2E7D32"/>
+        </w:rPr>
+        <w:t xml:space="preserve">✓ LA BONNE MÉTHODE</w:t>
+      </w:r>
+      <w:r>
+        <w:rPr>
+          <w:rFonts w:ascii="Arial" w:cs="Arial" w:eastAsia="Arial" w:hAnsi="Arial"/>
+          <w:i/>
+          <w:iCs/>
+          <w:color w:val="595959"/>
+        </w:rPr>
+        <w:t xml:space="preserve"> — retour à la procédure (étape 8).</w:t>
       </w:r>
     </w:p>
     <w:p>

</xml_diff>

<commit_message>
Script vidéo 1, étape 3 : « Chacun pose son cadenas, pis on vérifie que la foreuse peut pas repartir » (validé)
Co-Authored-By: Claude Opus 5.5 <noreply@anthropic.com>
Claude-Session: https://claude.ai/code/session_016YnqtNNUyZYY3JuA5BfKCG
</commit_message>
<xml_diff>
--- a/video/Script_PRO-OP-DD-005.docx
+++ b/video/Script_PRO-OP-DD-005.docx
@@ -409,14 +409,14 @@
         <w:rPr>
           <w:rFonts w:ascii="Arial" w:cs="Arial" w:eastAsia="Arial" w:hAnsi="Arial"/>
         </w:rPr>
-        <w:t xml:space="preserve">Étape trois : on cadenasse la foreuse. Le cadenas empêche de repartir l'hydraulique, mais les ressorts, eux, poussent encore. </w:t>
+        <w:t xml:space="preserve">Étape trois : on cadenasse la foreuse. </w:t>
       </w:r>
       <w:r>
         <w:rPr>
           <w:rFonts w:ascii="Arial" w:cs="Arial" w:eastAsia="Arial" w:hAnsi="Arial"/>
           <w:shd w:fill="FFE97F" w:color="auto" w:val="clear"/>
         </w:rPr>
-        <w:t xml:space="preserve">Cette énergie résiduelle, on la contrôle aussi : à l'étape six, les trois boulons longs, remis sans bushing, retiennent le cône. À l'étape sept, on desserre les six autres boulons un tour à la fois, pis les ressorts se détendent tranquillement.</w:t>
+        <w:t xml:space="preserve">Chacun pose son cadenas, pis on vérifie que la foreuse peut pas repartir. Le cadenas empêche de repartir l'hydraulique, mais les ressorts, eux, poussent encore. Cette énergie résiduelle, on la contrôle aussi : à l'étape six, les trois boulons longs, remis sans bushing, retiennent le cône. À l'étape sept, on desserre les six autres boulons un tour à la fois, pis les ressorts se détendent tranquillement.</w:t>
       </w:r>
     </w:p>
     <w:p>

</xml_diff>

<commit_message>
Script vidéo 1 : question de l'équipe sur le changement de quart (scellé et fiche d'intervention, validée)
Co-Authored-By: Claude Opus 5.5 <noreply@anthropic.com>
Claude-Session: https://claude.ai/code/session_016YnqtNNUyZYY3JuA5BfKCG
</commit_message>
<xml_diff>
--- a/video/Script_PRO-OP-DD-005.docx
+++ b/video/Script_PRO-OP-DD-005.docx
@@ -1217,6 +1217,76 @@
           <w:shd w:fill="FFE97F" w:color="auto" w:val="clear"/>
         </w:rPr>
         <w:t xml:space="preserve">Pas juste là. Il y a aussi la pression qui reste dans les boyaux hydrauliques, une pièce qui peut tomber, un câble tendu. Avant de démonter, on se demande toujours : qu'est-ce qui peut encore bouger ?</w:t>
+      </w:r>
+    </w:p>
+    <w:p>
+      <w:pPr>
+        <w:pBdr>
+          <w:left w:val="single" w:color="C55A11" w:sz="24" w:space="6"/>
+        </w:pBdr>
+        <w:shd w:fill="FCE9DB" w:color="auto" w:val="clear"/>
+        <w:spacing w:before="60" w:after="140"/>
+        <w:ind w:left="120" w:right="120"/>
+      </w:pPr>
+      <w:r>
+        <w:rPr>
+          <w:rFonts w:ascii="Arial" w:cs="Arial" w:eastAsia="Arial" w:hAnsi="Arial"/>
+          <w:b/>
+          <w:bCs/>
+          <w:color w:val="595959"/>
+        </w:rPr>
+        <w:t xml:space="preserve">[nouveau]  </w:t>
+      </w:r>
+      <w:r>
+        <w:rPr>
+          <w:rFonts w:ascii="Arial" w:cs="Arial" w:eastAsia="Arial" w:hAnsi="Arial"/>
+          <w:b/>
+          <w:bCs/>
+          <w:color w:val="C55A11"/>
+        </w:rPr>
+        <w:t xml:space="preserve">Travailleur : </w:t>
+      </w:r>
+      <w:r>
+        <w:rPr>
+          <w:rFonts w:ascii="Arial" w:cs="Arial" w:eastAsia="Arial" w:hAnsi="Arial"/>
+          <w:shd w:fill="FFE97F" w:color="auto" w:val="clear"/>
+        </w:rPr>
+        <w:t xml:space="preserve">Pis si le quart finit avant que la job soit faite ?</w:t>
+      </w:r>
+    </w:p>
+    <w:p>
+      <w:pPr>
+        <w:pBdr>
+          <w:left w:val="single" w:color="1F4E79" w:sz="24" w:space="6"/>
+        </w:pBdr>
+        <w:shd w:fill="E9F1FA" w:color="auto" w:val="clear"/>
+        <w:spacing w:before="60" w:after="140"/>
+        <w:ind w:left="120" w:right="120"/>
+      </w:pPr>
+      <w:r>
+        <w:rPr>
+          <w:rFonts w:ascii="Arial" w:cs="Arial" w:eastAsia="Arial" w:hAnsi="Arial"/>
+          <w:b/>
+          <w:bCs/>
+          <w:color w:val="595959"/>
+        </w:rPr>
+        <w:t xml:space="preserve">[nouveau]  </w:t>
+      </w:r>
+      <w:r>
+        <w:rPr>
+          <w:rFonts w:ascii="Arial" w:cs="Arial" w:eastAsia="Arial" w:hAnsi="Arial"/>
+          <w:b/>
+          <w:bCs/>
+          <w:color w:val="1F4E79"/>
+        </w:rPr>
+        <w:t xml:space="preserve">Formateur : </w:t>
+      </w:r>
+      <w:r>
+        <w:rPr>
+          <w:rFonts w:ascii="Arial" w:cs="Arial" w:eastAsia="Arial" w:hAnsi="Arial"/>
+          <w:shd w:fill="FFE97F" w:color="auto" w:val="clear"/>
+        </w:rPr>
+        <w:t xml:space="preserve">On pose un scellé sur la foreuse, avec une fiche qui explique la nature de l'intervention. Après, chacun peut enlever son cadenas. Le prochain quart sait exactement où on est rendu, pis chacun repose son cadenas avant de reprendre la job.</w:t>
       </w:r>
     </w:p>
     <w:p>

</xml_diff>

<commit_message>
Script vidéo 1, étape 9 : « L'énergie résiduelle a été relâchée lentement » (validé)
Co-Authored-By: Claude Opus 5.5 <noreply@anthropic.com>
Claude-Session: https://claude.ai/code/session_016YnqtNNUyZYY3JuA5BfKCG
</commit_message>
<xml_diff>
--- a/video/Script_PRO-OP-DD-005.docx
+++ b/video/Script_PRO-OP-DD-005.docx
@@ -833,7 +833,14 @@
         <w:rPr>
           <w:rFonts w:ascii="Arial" w:cs="Arial" w:eastAsia="Arial" w:hAnsi="Arial"/>
         </w:rPr>
-        <w:t xml:space="preserve">Étape neuf : on sort le cône, le bowl, pis les mâchoires, et on change les pièces. L'énergie a été relâchée lentement : le cône est resté retenu tout le long.</w:t>
+        <w:t xml:space="preserve">Étape neuf : on sort le cône, le bowl, pis les mâchoires, et on change les pièces. </w:t>
+      </w:r>
+      <w:r>
+        <w:rPr>
+          <w:rFonts w:ascii="Arial" w:cs="Arial" w:eastAsia="Arial" w:hAnsi="Arial"/>
+          <w:shd w:fill="FFE97F" w:color="auto" w:val="clear"/>
+        </w:rPr>
+        <w:t xml:space="preserve">L'énergie résiduelle a été relâchée lentement : le cône est resté retenu tout le long.</w:t>
       </w:r>
     </w:p>
     <w:p>

</xml_diff>

<commit_message>
Script vidéo 1 : questions de l'équipe regroupées par thème (validé)
Pendant le dévissage (où se placer, boulon qui veut pas se défaire, cône coincé, sauter l'étape 6), énergie et
cadenas (énergie résiduelle ailleurs, changement de quart), puis « si quelque chose me semble pas normal ». Texte
inchangé ; les questions déjà enregistrées gardent leur temps dans la vidéo actuelle.

Co-Authored-By: Claude Opus 5.5 <noreply@anthropic.com>
Claude-Session: https://claude.ai/code/session_016YnqtNNUyZYY3JuA5BfKCG
</commit_message>
<xml_diff>
--- a/video/Script_PRO-OP-DD-005.docx
+++ b/video/Script_PRO-OP-DD-005.docx
@@ -900,6 +900,74 @@
           <w:bCs/>
           <w:color w:val="595959"/>
         </w:rPr>
+        <w:t xml:space="preserve">[2:26]  </w:t>
+      </w:r>
+      <w:r>
+        <w:rPr>
+          <w:rFonts w:ascii="Arial" w:cs="Arial" w:eastAsia="Arial" w:hAnsi="Arial"/>
+          <w:b/>
+          <w:bCs/>
+          <w:color w:val="C55A11"/>
+        </w:rPr>
+        <w:t xml:space="preserve">Travailleur : </w:t>
+      </w:r>
+      <w:r>
+        <w:rPr>
+          <w:rFonts w:ascii="Arial" w:cs="Arial" w:eastAsia="Arial" w:hAnsi="Arial"/>
+        </w:rPr>
+        <w:t xml:space="preserve">Pendant que je dévisse, je me place où ?</w:t>
+      </w:r>
+    </w:p>
+    <w:p>
+      <w:pPr>
+        <w:pBdr>
+          <w:left w:val="single" w:color="1F4E79" w:sz="24" w:space="6"/>
+        </w:pBdr>
+        <w:shd w:fill="E9F1FA" w:color="auto" w:val="clear"/>
+        <w:spacing w:before="60" w:after="140"/>
+        <w:ind w:left="120" w:right="120"/>
+      </w:pPr>
+      <w:r>
+        <w:rPr>
+          <w:rFonts w:ascii="Arial" w:cs="Arial" w:eastAsia="Arial" w:hAnsi="Arial"/>
+          <w:b/>
+          <w:bCs/>
+          <w:color w:val="595959"/>
+        </w:rPr>
+        <w:t xml:space="preserve">[2:29]  </w:t>
+      </w:r>
+      <w:r>
+        <w:rPr>
+          <w:rFonts w:ascii="Arial" w:cs="Arial" w:eastAsia="Arial" w:hAnsi="Arial"/>
+          <w:b/>
+          <w:bCs/>
+          <w:color w:val="1F4E79"/>
+        </w:rPr>
+        <w:t xml:space="preserve">Formateur : </w:t>
+      </w:r>
+      <w:r>
+        <w:rPr>
+          <w:rFonts w:ascii="Arial" w:cs="Arial" w:eastAsia="Arial" w:hAnsi="Arial"/>
+        </w:rPr>
+        <w:t xml:space="preserve">Hors de l'axe du mandrin. Jamais devant le cône : s'il part, c'est là qu'il s'en va.</w:t>
+      </w:r>
+    </w:p>
+    <w:p>
+      <w:pPr>
+        <w:pBdr>
+          <w:left w:val="single" w:color="C55A11" w:sz="24" w:space="6"/>
+        </w:pBdr>
+        <w:shd w:fill="FCE9DB" w:color="auto" w:val="clear"/>
+        <w:spacing w:before="60" w:after="140"/>
+        <w:ind w:left="120" w:right="120"/>
+      </w:pPr>
+      <w:r>
+        <w:rPr>
+          <w:rFonts w:ascii="Arial" w:cs="Arial" w:eastAsia="Arial" w:hAnsi="Arial"/>
+          <w:b/>
+          <w:bCs/>
+          <w:color w:val="595959"/>
+        </w:rPr>
         <w:t xml:space="preserve">[2:17]  </w:t>
       </w:r>
       <w:r>
@@ -950,74 +1018,6 @@
           <w:rFonts w:ascii="Arial" w:cs="Arial" w:eastAsia="Arial" w:hAnsi="Arial"/>
         </w:rPr>
         <w:t xml:space="preserve">On force pas à l'impact drill sous charge. On arrête, pis on en parle au superviseur avant de continuer.</w:t>
-      </w:r>
-    </w:p>
-    <w:p>
-      <w:pPr>
-        <w:pBdr>
-          <w:left w:val="single" w:color="C55A11" w:sz="24" w:space="6"/>
-        </w:pBdr>
-        <w:shd w:fill="FCE9DB" w:color="auto" w:val="clear"/>
-        <w:spacing w:before="60" w:after="140"/>
-        <w:ind w:left="120" w:right="120"/>
-      </w:pPr>
-      <w:r>
-        <w:rPr>
-          <w:rFonts w:ascii="Arial" w:cs="Arial" w:eastAsia="Arial" w:hAnsi="Arial"/>
-          <w:b/>
-          <w:bCs/>
-          <w:color w:val="595959"/>
-        </w:rPr>
-        <w:t xml:space="preserve">[2:26]  </w:t>
-      </w:r>
-      <w:r>
-        <w:rPr>
-          <w:rFonts w:ascii="Arial" w:cs="Arial" w:eastAsia="Arial" w:hAnsi="Arial"/>
-          <w:b/>
-          <w:bCs/>
-          <w:color w:val="C55A11"/>
-        </w:rPr>
-        <w:t xml:space="preserve">Travailleur : </w:t>
-      </w:r>
-      <w:r>
-        <w:rPr>
-          <w:rFonts w:ascii="Arial" w:cs="Arial" w:eastAsia="Arial" w:hAnsi="Arial"/>
-        </w:rPr>
-        <w:t xml:space="preserve">Pendant que je dévisse, je me place où ?</w:t>
-      </w:r>
-    </w:p>
-    <w:p>
-      <w:pPr>
-        <w:pBdr>
-          <w:left w:val="single" w:color="1F4E79" w:sz="24" w:space="6"/>
-        </w:pBdr>
-        <w:shd w:fill="E9F1FA" w:color="auto" w:val="clear"/>
-        <w:spacing w:before="60" w:after="140"/>
-        <w:ind w:left="120" w:right="120"/>
-      </w:pPr>
-      <w:r>
-        <w:rPr>
-          <w:rFonts w:ascii="Arial" w:cs="Arial" w:eastAsia="Arial" w:hAnsi="Arial"/>
-          <w:b/>
-          <w:bCs/>
-          <w:color w:val="595959"/>
-        </w:rPr>
-        <w:t xml:space="preserve">[2:29]  </w:t>
-      </w:r>
-      <w:r>
-        <w:rPr>
-          <w:rFonts w:ascii="Arial" w:cs="Arial" w:eastAsia="Arial" w:hAnsi="Arial"/>
-          <w:b/>
-          <w:bCs/>
-          <w:color w:val="1F4E79"/>
-        </w:rPr>
-        <w:t xml:space="preserve">Formateur : </w:t>
-      </w:r>
-      <w:r>
-        <w:rPr>
-          <w:rFonts w:ascii="Arial" w:cs="Arial" w:eastAsia="Arial" w:hAnsi="Arial"/>
-        </w:rPr>
-        <w:t xml:space="preserve">Hors de l'axe du mandrin. Jamais devant le cône : s'il part, c'est là qu'il s'en va.</w:t>
       </w:r>
     </w:p>
     <w:p>

</xml_diff>

<commit_message>
Vidéo 1 : carte finale « À vous la parole » (cadenassage et énergie résiduelle, 3 questions, validée)
Dernière image, sans voix, à la place du fondu au noir : trois questions pour la discussion en équipe.
A/arrets.json ; document Word.

Co-Authored-By: Claude Opus 5.5 <noreply@anthropic.com>
Claude-Session: https://claude.ai/code/session_016YnqtNNUyZYY3JuA5BfKCG
</commit_message>
<xml_diff>
--- a/video/Script_PRO-OP-DD-005.docx
+++ b/video/Script_PRO-OP-DD-005.docx
@@ -1362,6 +1362,50 @@
           <w:rFonts w:ascii="Arial" w:cs="Arial" w:eastAsia="Arial" w:hAnsi="Arial"/>
         </w:rPr>
         <w:t xml:space="preserve">Tu arrêtes, pis tu en parles au superviseur. On regarde ça ensemble avant de continuer.</w:t>
+      </w:r>
+    </w:p>
+    <w:p>
+      <w:pPr>
+        <w:pBdr>
+          <w:left w:val="dashed" w:color="B7791F" w:sz="24" w:space="6"/>
+        </w:pBdr>
+        <w:shd w:fill="FFF8E1" w:color="auto" w:val="clear"/>
+        <w:spacing w:before="60" w:after="140"/>
+        <w:ind w:left="120" w:right="120"/>
+      </w:pPr>
+      <w:r>
+        <w:rPr>
+          <w:rFonts w:ascii="Arial" w:cs="Arial" w:eastAsia="Arial" w:hAnsi="Arial"/>
+          <w:b/>
+          <w:bCs/>
+          <w:color w:val="595959"/>
+        </w:rPr>
+        <w:t xml:space="preserve">[nouveau]  </w:t>
+      </w:r>
+      <w:r>
+        <w:rPr>
+          <w:rFonts w:ascii="Arial" w:cs="Arial" w:eastAsia="Arial" w:hAnsi="Arial"/>
+          <w:b/>
+          <w:bCs/>
+          <w:color w:val="8A5A00"/>
+        </w:rPr>
+        <w:t xml:space="preserve">⏸ À VOUS LA PAROLE (dernière image, sans voix) : </w:t>
+      </w:r>
+      <w:r>
+        <w:rPr>
+          <w:rFonts w:ascii="Arial" w:cs="Arial" w:eastAsia="Arial" w:hAnsi="Arial"/>
+          <w:shd w:fill="FFE97F" w:color="auto" w:val="clear"/>
+        </w:rPr>
+        <w:t xml:space="preserve">Sur nos équipements, où est-ce qu'il peut rester de l'énergie résiduelle après le cadenassage ? • Dans votre travail, quand est-ce que le cadenas suffit pas, pis qu'il faut contrôler une énergie qui reste ? • Qu'est-ce qu'on doit vérifier avant de démonter, une fois la foreuse cadenassée ?</w:t>
+      </w:r>
+      <w:r>
+        <w:rPr>
+          <w:rFonts w:ascii="Arial" w:cs="Arial" w:eastAsia="Arial" w:hAnsi="Arial"/>
+          <w:i/>
+          <w:iCs/>
+          <w:color w:val="595959"/>
+        </w:rPr>
+        <w:t xml:space="preserve">  Mettez la vidéo sur pause et discutez en équipe.</w:t>
       </w:r>
     </w:p>
     <w:sectPr>

</xml_diff>

<commit_message>
Étape 1 : danger des manettes laissées ouvertes (procédure PRO-OP-DD-005, étape 1), scripts FR et EN
« Pourquoi fermées ? En position ouverte, l'hydraulique pousse le vérin, pis les ressorts sont écrasés au maximum… »
(fermées : ressorts étirés au maximum, selon la procédure écrite). A/script-v3.json (seul ajout à enregistrer en français),
A/script-v2-en.json et script anglais Word ; script français Word avec les temps de la vidéo en ligne (5 min 37 s).

Co-Authored-By: Claude Opus 5.5 <noreply@anthropic.com>
Claude-Session: https://claude.ai/code/session_016YnqtNNUyZYY3JuA5BfKCG
</commit_message>
<xml_diff>
--- a/video/Script_PRO-OP-DD-005.docx
+++ b/video/Script_PRO-OP-DD-005.docx
@@ -30,7 +30,7 @@
           <w:sz w:val="20"/>
           <w:szCs w:val="20"/>
         </w:rPr>
-        <w:t xml:space="preserve">Le temps entre crochets indique où la réplique commence dans la vidéo actuelle (3 min 06 s). </w:t>
+        <w:t xml:space="preserve">Le temps entre crochets indique où la réplique commence dans la vidéo en ligne (5 min 37 s). </w:t>
       </w:r>
       <w:r>
         <w:rPr>
@@ -139,7 +139,7 @@
           <w:bCs/>
           <w:color w:val="595959"/>
         </w:rPr>
-        <w:t xml:space="preserve">[0:03]  </w:t>
+        <w:t xml:space="preserve">[0:04]  </w:t>
       </w:r>
       <w:r>
         <w:rPr>
@@ -173,7 +173,7 @@
           <w:bCs/>
           <w:color w:val="595959"/>
         </w:rPr>
-        <w:t xml:space="preserve">[0:06]  </w:t>
+        <w:t xml:space="preserve">[0:07]  </w:t>
       </w:r>
       <w:r>
         <w:rPr>
@@ -207,7 +207,7 @@
           <w:bCs/>
           <w:color w:val="595959"/>
         </w:rPr>
-        <w:t xml:space="preserve">[0:11]  </w:t>
+        <w:t xml:space="preserve">[0:14]  </w:t>
       </w:r>
       <w:r>
         <w:rPr>
@@ -241,63 +241,63 @@
           <w:bCs/>
           <w:color w:val="595959"/>
         </w:rPr>
-        <w:t xml:space="preserve">[0:15]  </w:t>
-      </w:r>
-      <w:r>
-        <w:rPr>
-          <w:rFonts w:ascii="Arial" w:cs="Arial" w:eastAsia="Arial" w:hAnsi="Arial"/>
-          <w:b/>
-          <w:bCs/>
-          <w:color w:val="1F4E79"/>
-        </w:rPr>
-        <w:t xml:space="preserve">Formateur : </w:t>
-      </w:r>
-      <w:r>
-        <w:rPr>
-          <w:rFonts w:ascii="Arial" w:cs="Arial" w:eastAsia="Arial" w:hAnsi="Arial"/>
-        </w:rPr>
-        <w:t xml:space="preserve">Étape un : les manettes Clam et Chuck en position fermée.</w:t>
-      </w:r>
-    </w:p>
-    <w:p>
-      <w:pPr>
-        <w:pBdr>
-          <w:left w:val="single" w:color="1F4E79" w:sz="24" w:space="6"/>
-        </w:pBdr>
-        <w:shd w:fill="E9F1FA" w:color="auto" w:val="clear"/>
-        <w:spacing w:before="60" w:after="140"/>
-        <w:ind w:left="120" w:right="120"/>
-      </w:pPr>
-      <w:r>
-        <w:rPr>
-          <w:rFonts w:ascii="Arial" w:cs="Arial" w:eastAsia="Arial" w:hAnsi="Arial"/>
-          <w:b/>
-          <w:bCs/>
-          <w:color w:val="595959"/>
-        </w:rPr>
-        <w:t xml:space="preserve">[0:20]  </w:t>
-      </w:r>
-      <w:r>
-        <w:rPr>
-          <w:rFonts w:ascii="Arial" w:cs="Arial" w:eastAsia="Arial" w:hAnsi="Arial"/>
-          <w:b/>
-          <w:bCs/>
-          <w:color w:val="1F4E79"/>
-        </w:rPr>
-        <w:t xml:space="preserve">Formateur : </w:t>
-      </w:r>
-      <w:r>
-        <w:rPr>
-          <w:rFonts w:ascii="Arial" w:cs="Arial" w:eastAsia="Arial" w:hAnsi="Arial"/>
-        </w:rPr>
-        <w:t xml:space="preserve">Regardez la coupe : l'hydraulique est coupé, mais les ressorts verts sont encore comprimés. Fermer les manettes ne libère pas leur énergie. </w:t>
+        <w:t xml:space="preserve">[0:18]  </w:t>
+      </w:r>
+      <w:r>
+        <w:rPr>
+          <w:rFonts w:ascii="Arial" w:cs="Arial" w:eastAsia="Arial" w:hAnsi="Arial"/>
+          <w:b/>
+          <w:bCs/>
+          <w:color w:val="1F4E79"/>
+        </w:rPr>
+        <w:t xml:space="preserve">Formateur : </w:t>
+      </w:r>
+      <w:r>
+        <w:rPr>
+          <w:rFonts w:ascii="Arial" w:cs="Arial" w:eastAsia="Arial" w:hAnsi="Arial"/>
+        </w:rPr>
+        <w:t xml:space="preserve">Étape un : les manettes Clam et Chuck en position fermée. </w:t>
       </w:r>
       <w:r>
         <w:rPr>
           <w:rFonts w:ascii="Arial" w:cs="Arial" w:eastAsia="Arial" w:hAnsi="Arial"/>
           <w:shd w:fill="FFE97F" w:color="auto" w:val="clear"/>
         </w:rPr>
-        <w:t xml:space="preserve">C'est ce qu'on appelle de l'énergie résiduelle : elle reste emmagasinée dans l'équipement, même quand la source est arrêtée.</w:t>
+        <w:t xml:space="preserve">Pourquoi fermées ? En position ouverte, l'hydraulique pousse le vérin, pis les ressorts sont écrasés au maximum. Si on cadenasse comme ça, le cadenas n'y change rien : toute cette énergie-là reste prise dans le mandrin. Fermées, les ressorts sont étirés au maximum : c'est là qu'il en reste le moins.</w:t>
+      </w:r>
+    </w:p>
+    <w:p>
+      <w:pPr>
+        <w:pBdr>
+          <w:left w:val="single" w:color="1F4E79" w:sz="24" w:space="6"/>
+        </w:pBdr>
+        <w:shd w:fill="E9F1FA" w:color="auto" w:val="clear"/>
+        <w:spacing w:before="60" w:after="140"/>
+        <w:ind w:left="120" w:right="120"/>
+      </w:pPr>
+      <w:r>
+        <w:rPr>
+          <w:rFonts w:ascii="Arial" w:cs="Arial" w:eastAsia="Arial" w:hAnsi="Arial"/>
+          <w:b/>
+          <w:bCs/>
+          <w:color w:val="595959"/>
+        </w:rPr>
+        <w:t xml:space="preserve">[0:25]  </w:t>
+      </w:r>
+      <w:r>
+        <w:rPr>
+          <w:rFonts w:ascii="Arial" w:cs="Arial" w:eastAsia="Arial" w:hAnsi="Arial"/>
+          <w:b/>
+          <w:bCs/>
+          <w:color w:val="1F4E79"/>
+        </w:rPr>
+        <w:t xml:space="preserve">Formateur : </w:t>
+      </w:r>
+      <w:r>
+        <w:rPr>
+          <w:rFonts w:ascii="Arial" w:cs="Arial" w:eastAsia="Arial" w:hAnsi="Arial"/>
+        </w:rPr>
+        <w:t xml:space="preserve">Regardez la coupe : l'hydraulique est coupé, mais les ressorts verts sont encore comprimés. Fermer les manettes ne libère pas leur énergie. C'est ce qu'on appelle de l'énergie résiduelle : elle reste emmagasinée dans l'équipement, même quand la source est arrêtée.</w:t>
       </w:r>
     </w:p>
     <w:p>
@@ -316,7 +316,7 @@
           <w:bCs/>
           <w:color w:val="595959"/>
         </w:rPr>
-        <w:t xml:space="preserve">[nouveau]  </w:t>
+        <w:t xml:space="preserve">[0:41]  </w:t>
       </w:r>
       <w:r>
         <w:rPr>
@@ -330,7 +330,6 @@
       <w:r>
         <w:rPr>
           <w:rFonts w:ascii="Arial" w:cs="Arial" w:eastAsia="Arial" w:hAnsi="Arial"/>
-          <w:shd w:fill="FFE97F" w:color="auto" w:val="clear"/>
         </w:rPr>
         <w:t xml:space="preserve">Les ressorts sont encore comprimés. Selon vous, comment on peut relâcher cette énergie-là sans danger ?</w:t>
       </w:r>
@@ -360,7 +359,7 @@
           <w:bCs/>
           <w:color w:val="595959"/>
         </w:rPr>
-        <w:t xml:space="preserve">[0:28]  </w:t>
+        <w:t xml:space="preserve">[0:50]  </w:t>
       </w:r>
       <w:r>
         <w:rPr>
@@ -394,48 +393,41 @@
           <w:bCs/>
           <w:color w:val="595959"/>
         </w:rPr>
-        <w:t xml:space="preserve">[0:33]  </w:t>
-      </w:r>
-      <w:r>
-        <w:rPr>
-          <w:rFonts w:ascii="Arial" w:cs="Arial" w:eastAsia="Arial" w:hAnsi="Arial"/>
-          <w:b/>
-          <w:bCs/>
-          <w:color w:val="1F4E79"/>
-        </w:rPr>
-        <w:t xml:space="preserve">Formateur : </w:t>
-      </w:r>
-      <w:r>
-        <w:rPr>
-          <w:rFonts w:ascii="Arial" w:cs="Arial" w:eastAsia="Arial" w:hAnsi="Arial"/>
-        </w:rPr>
-        <w:t xml:space="preserve">Étape trois : on cadenasse la foreuse. </w:t>
-      </w:r>
-      <w:r>
-        <w:rPr>
-          <w:rFonts w:ascii="Arial" w:cs="Arial" w:eastAsia="Arial" w:hAnsi="Arial"/>
-          <w:shd w:fill="FFE97F" w:color="auto" w:val="clear"/>
-        </w:rPr>
-        <w:t xml:space="preserve">Chacun pose son cadenas, pis on vérifie que la foreuse peut pas repartir. Le cadenas empêche de repartir l'hydraulique, mais les ressorts, eux, poussent encore. Cette énergie résiduelle, on la contrôle aussi : à l'étape six, les trois boulons longs, remis sans bushing, retiennent le cône. À l'étape sept, on desserre les six autres boulons un tour à la fois, pis les ressorts se détendent tranquillement.</w:t>
-      </w:r>
-    </w:p>
-    <w:p>
-      <w:pPr>
-        <w:pBdr>
-          <w:left w:val="single" w:color="1F4E79" w:sz="24" w:space="6"/>
-        </w:pBdr>
-        <w:shd w:fill="E9F1FA" w:color="auto" w:val="clear"/>
-        <w:spacing w:before="60" w:after="140"/>
-        <w:ind w:left="120" w:right="120"/>
-      </w:pPr>
-      <w:r>
-        <w:rPr>
-          <w:rFonts w:ascii="Arial" w:cs="Arial" w:eastAsia="Arial" w:hAnsi="Arial"/>
-          <w:b/>
-          <w:bCs/>
-          <w:color w:val="595959"/>
-        </w:rPr>
-        <w:t xml:space="preserve">[0:41]  </w:t>
+        <w:t xml:space="preserve">[0:56]  </w:t>
+      </w:r>
+      <w:r>
+        <w:rPr>
+          <w:rFonts w:ascii="Arial" w:cs="Arial" w:eastAsia="Arial" w:hAnsi="Arial"/>
+          <w:b/>
+          <w:bCs/>
+          <w:color w:val="1F4E79"/>
+        </w:rPr>
+        <w:t xml:space="preserve">Formateur : </w:t>
+      </w:r>
+      <w:r>
+        <w:rPr>
+          <w:rFonts w:ascii="Arial" w:cs="Arial" w:eastAsia="Arial" w:hAnsi="Arial"/>
+        </w:rPr>
+        <w:t xml:space="preserve">Étape trois : on cadenasse la foreuse. Chacun pose son cadenas, pis on vérifie que la foreuse peut pas repartir. Le cadenas empêche de repartir l'hydraulique, mais les ressorts, eux, poussent encore. Cette énergie résiduelle, on la contrôle aussi : à l'étape six, les trois boulons longs, remis sans bushing, retiennent le cône. À l'étape sept, on desserre les six autres boulons un tour à la fois, pis les ressorts se détendent tranquillement.</w:t>
+      </w:r>
+    </w:p>
+    <w:p>
+      <w:pPr>
+        <w:pBdr>
+          <w:left w:val="single" w:color="1F4E79" w:sz="24" w:space="6"/>
+        </w:pBdr>
+        <w:shd w:fill="E9F1FA" w:color="auto" w:val="clear"/>
+        <w:spacing w:before="60" w:after="140"/>
+        <w:ind w:left="120" w:right="120"/>
+      </w:pPr>
+      <w:r>
+        <w:rPr>
+          <w:rFonts w:ascii="Arial" w:cs="Arial" w:eastAsia="Arial" w:hAnsi="Arial"/>
+          <w:b/>
+          <w:bCs/>
+          <w:color w:val="595959"/>
+        </w:rPr>
+        <w:t xml:space="preserve">[1:26]  </w:t>
       </w:r>
       <w:r>
         <w:rPr>
@@ -469,7 +461,7 @@
           <w:bCs/>
           <w:color w:val="595959"/>
         </w:rPr>
-        <w:t xml:space="preserve">[0:49]  </w:t>
+        <w:t xml:space="preserve">[1:35]  </w:t>
       </w:r>
       <w:r>
         <w:rPr>
@@ -503,21 +495,20 @@
           <w:bCs/>
           <w:color w:val="595959"/>
         </w:rPr>
-        <w:t xml:space="preserve">[1:01]  </w:t>
-      </w:r>
-      <w:r>
-        <w:rPr>
-          <w:rFonts w:ascii="Arial" w:cs="Arial" w:eastAsia="Arial" w:hAnsi="Arial"/>
-          <w:b/>
-          <w:bCs/>
-          <w:color w:val="1F4E79"/>
-        </w:rPr>
-        <w:t xml:space="preserve">Formateur : </w:t>
-      </w:r>
-      <w:r>
-        <w:rPr>
-          <w:rFonts w:ascii="Arial" w:cs="Arial" w:eastAsia="Arial" w:hAnsi="Arial"/>
-          <w:shd w:fill="FFE97F" w:color="auto" w:val="clear"/>
+        <w:t xml:space="preserve">[1:47]  </w:t>
+      </w:r>
+      <w:r>
+        <w:rPr>
+          <w:rFonts w:ascii="Arial" w:cs="Arial" w:eastAsia="Arial" w:hAnsi="Arial"/>
+          <w:b/>
+          <w:bCs/>
+          <w:color w:val="1F4E79"/>
+        </w:rPr>
+        <w:t xml:space="preserve">Formateur : </w:t>
+      </w:r>
+      <w:r>
+        <w:rPr>
+          <w:rFonts w:ascii="Arial" w:cs="Arial" w:eastAsia="Arial" w:hAnsi="Arial"/>
         </w:rPr>
         <w:t xml:space="preserve">Étape six, c'est la clé de toute la job. Il est important de desserrer les boulons longs un à la fois, de retirer l'espaceur, qu'on appelle le bushing, pis de resserrer complètement le boulon sans bushing.</w:t>
       </w:r>
@@ -538,21 +529,20 @@
           <w:bCs/>
           <w:color w:val="595959"/>
         </w:rPr>
-        <w:t xml:space="preserve">[1:08]  </w:t>
-      </w:r>
-      <w:r>
-        <w:rPr>
-          <w:rFonts w:ascii="Arial" w:cs="Arial" w:eastAsia="Arial" w:hAnsi="Arial"/>
-          <w:b/>
-          <w:bCs/>
-          <w:color w:val="1F4E79"/>
-        </w:rPr>
-        <w:t xml:space="preserve">Formateur : </w:t>
-      </w:r>
-      <w:r>
-        <w:rPr>
-          <w:rFonts w:ascii="Arial" w:cs="Arial" w:eastAsia="Arial" w:hAnsi="Arial"/>
-          <w:shd w:fill="FFE97F" w:color="auto" w:val="clear"/>
+        <w:t xml:space="preserve">[2:01]  </w:t>
+      </w:r>
+      <w:r>
+        <w:rPr>
+          <w:rFonts w:ascii="Arial" w:cs="Arial" w:eastAsia="Arial" w:hAnsi="Arial"/>
+          <w:b/>
+          <w:bCs/>
+          <w:color w:val="1F4E79"/>
+        </w:rPr>
+        <w:t xml:space="preserve">Formateur : </w:t>
+      </w:r>
+      <w:r>
+        <w:rPr>
+          <w:rFonts w:ascii="Arial" w:cs="Arial" w:eastAsia="Arial" w:hAnsi="Arial"/>
         </w:rPr>
         <w:t xml:space="preserve">Ça nous permet d'avoir l'espace requis pour desserrer les six autres boulons, tout en enlevant la tension des ressorts. Pis on garde une sécurité supplémentaire avec les trois boulons longs toujours en place.</w:t>
       </w:r>
@@ -573,7 +563,7 @@
           <w:bCs/>
           <w:color w:val="595959"/>
         </w:rPr>
-        <w:t xml:space="preserve">[1:15]  </w:t>
+        <w:t xml:space="preserve">[2:14]  </w:t>
       </w:r>
       <w:r>
         <w:rPr>
@@ -607,7 +597,7 @@
           <w:bCs/>
           <w:color w:val="595959"/>
         </w:rPr>
-        <w:t xml:space="preserve">[1:32]  </w:t>
+        <w:t xml:space="preserve">[2:31]  </w:t>
       </w:r>
       <w:r>
         <w:rPr>
@@ -641,7 +631,7 @@
           <w:bCs/>
           <w:color w:val="595959"/>
         </w:rPr>
-        <w:t xml:space="preserve">[nouveau]  </w:t>
+        <w:t xml:space="preserve">[2:41]  </w:t>
       </w:r>
       <w:r>
         <w:rPr>
@@ -678,21 +668,20 @@
           <w:bCs/>
           <w:color w:val="595959"/>
         </w:rPr>
-        <w:t xml:space="preserve">[nouveau]  </w:t>
-      </w:r>
-      <w:r>
-        <w:rPr>
-          <w:rFonts w:ascii="Arial" w:cs="Arial" w:eastAsia="Arial" w:hAnsi="Arial"/>
-          <w:b/>
-          <w:bCs/>
-          <w:color w:val="1F4E79"/>
-        </w:rPr>
-        <w:t xml:space="preserve">Formateur : </w:t>
-      </w:r>
-      <w:r>
-        <w:rPr>
-          <w:rFonts w:ascii="Arial" w:cs="Arial" w:eastAsia="Arial" w:hAnsi="Arial"/>
-          <w:shd w:fill="FFE97F" w:color="auto" w:val="clear"/>
+        <w:t xml:space="preserve">[2:42]  </w:t>
+      </w:r>
+      <w:r>
+        <w:rPr>
+          <w:rFonts w:ascii="Arial" w:cs="Arial" w:eastAsia="Arial" w:hAnsi="Arial"/>
+          <w:b/>
+          <w:bCs/>
+          <w:color w:val="1F4E79"/>
+        </w:rPr>
+        <w:t xml:space="preserve">Formateur : </w:t>
+      </w:r>
+      <w:r>
+        <w:rPr>
+          <w:rFonts w:ascii="Arial" w:cs="Arial" w:eastAsia="Arial" w:hAnsi="Arial"/>
         </w:rPr>
         <w:t xml:space="preserve">Regardez ce qui arrive si on sort les boulons au complet, un après l'autre, sans s'occuper de l'énergie résiduelle. Les ressorts restent comprimés, pis chaque boulon enlevé laisse plus de charge aux autres. Le dernier porte toute la force : il casse, pis le cône est projeté. C'est pour ça qu'on y va un tour à la fois.</w:t>
       </w:r>
@@ -713,7 +702,7 @@
           <w:bCs/>
           <w:color w:val="595959"/>
         </w:rPr>
-        <w:t xml:space="preserve">[nouveau]  </w:t>
+        <w:t xml:space="preserve">[3:06]  </w:t>
       </w:r>
       <w:r>
         <w:rPr>
@@ -750,7 +739,7 @@
           <w:bCs/>
           <w:color w:val="595959"/>
         </w:rPr>
-        <w:t xml:space="preserve">[1:41]  </w:t>
+        <w:t xml:space="preserve">[3:10]  </w:t>
       </w:r>
       <w:r>
         <w:rPr>
@@ -784,7 +773,7 @@
           <w:bCs/>
           <w:color w:val="595959"/>
         </w:rPr>
-        <w:t xml:space="preserve">[1:48]  </w:t>
+        <w:t xml:space="preserve">[3:17]  </w:t>
       </w:r>
       <w:r>
         <w:rPr>
@@ -818,70 +807,56 @@
           <w:bCs/>
           <w:color w:val="595959"/>
         </w:rPr>
-        <w:t xml:space="preserve">[1:54]  </w:t>
-      </w:r>
-      <w:r>
-        <w:rPr>
-          <w:rFonts w:ascii="Arial" w:cs="Arial" w:eastAsia="Arial" w:hAnsi="Arial"/>
-          <w:b/>
-          <w:bCs/>
-          <w:color w:val="1F4E79"/>
-        </w:rPr>
-        <w:t xml:space="preserve">Formateur : </w:t>
-      </w:r>
-      <w:r>
-        <w:rPr>
-          <w:rFonts w:ascii="Arial" w:cs="Arial" w:eastAsia="Arial" w:hAnsi="Arial"/>
-        </w:rPr>
-        <w:t xml:space="preserve">Étape neuf : on sort le cône, le bowl, pis les mâchoires, et on change les pièces. </w:t>
-      </w:r>
-      <w:r>
-        <w:rPr>
-          <w:rFonts w:ascii="Arial" w:cs="Arial" w:eastAsia="Arial" w:hAnsi="Arial"/>
-          <w:shd w:fill="FFE97F" w:color="auto" w:val="clear"/>
-        </w:rPr>
-        <w:t xml:space="preserve">L'énergie résiduelle a été relâchée lentement : le cône est resté retenu tout le long.</w:t>
-      </w:r>
-    </w:p>
-    <w:p>
-      <w:pPr>
-        <w:pBdr>
-          <w:left w:val="single" w:color="1F4E79" w:sz="24" w:space="6"/>
-        </w:pBdr>
-        <w:shd w:fill="E9F1FA" w:color="auto" w:val="clear"/>
-        <w:spacing w:before="60" w:after="140"/>
-        <w:ind w:left="120" w:right="120"/>
-      </w:pPr>
-      <w:r>
-        <w:rPr>
-          <w:rFonts w:ascii="Arial" w:cs="Arial" w:eastAsia="Arial" w:hAnsi="Arial"/>
-          <w:b/>
-          <w:bCs/>
-          <w:color w:val="595959"/>
-        </w:rPr>
-        <w:t xml:space="preserve">[2:05]  </w:t>
-      </w:r>
-      <w:r>
-        <w:rPr>
-          <w:rFonts w:ascii="Arial" w:cs="Arial" w:eastAsia="Arial" w:hAnsi="Arial"/>
-          <w:b/>
-          <w:bCs/>
-          <w:color w:val="1F4E79"/>
-        </w:rPr>
-        <w:t xml:space="preserve">Formateur : </w:t>
-      </w:r>
-      <w:r>
-        <w:rPr>
-          <w:rFonts w:ascii="Arial" w:cs="Arial" w:eastAsia="Arial" w:hAnsi="Arial"/>
-        </w:rPr>
-        <w:t xml:space="preserve">Pour le quart : jamais un boulon du cône enlevé au complet sous charge. </w:t>
-      </w:r>
-      <w:r>
-        <w:rPr>
-          <w:rFonts w:ascii="Arial" w:cs="Arial" w:eastAsia="Arial" w:hAnsi="Arial"/>
-          <w:shd w:fill="FFE97F" w:color="auto" w:val="clear"/>
-        </w:rPr>
-        <w:t xml:space="preserve">Les trois boulons longs sans bushing, avant de desserrer les six autres boulons. Pis un tour à la fois.</w:t>
+        <w:t xml:space="preserve">[3:24]  </w:t>
+      </w:r>
+      <w:r>
+        <w:rPr>
+          <w:rFonts w:ascii="Arial" w:cs="Arial" w:eastAsia="Arial" w:hAnsi="Arial"/>
+          <w:b/>
+          <w:bCs/>
+          <w:color w:val="1F4E79"/>
+        </w:rPr>
+        <w:t xml:space="preserve">Formateur : </w:t>
+      </w:r>
+      <w:r>
+        <w:rPr>
+          <w:rFonts w:ascii="Arial" w:cs="Arial" w:eastAsia="Arial" w:hAnsi="Arial"/>
+        </w:rPr>
+        <w:t xml:space="preserve">Étape neuf : on sort le cône, le bowl, pis les mâchoires, et on change les pièces. L'énergie résiduelle a été relâchée lentement : le cône est resté retenu tout le long.</w:t>
+      </w:r>
+    </w:p>
+    <w:p>
+      <w:pPr>
+        <w:pBdr>
+          <w:left w:val="single" w:color="1F4E79" w:sz="24" w:space="6"/>
+        </w:pBdr>
+        <w:shd w:fill="E9F1FA" w:color="auto" w:val="clear"/>
+        <w:spacing w:before="60" w:after="140"/>
+        <w:ind w:left="120" w:right="120"/>
+      </w:pPr>
+      <w:r>
+        <w:rPr>
+          <w:rFonts w:ascii="Arial" w:cs="Arial" w:eastAsia="Arial" w:hAnsi="Arial"/>
+          <w:b/>
+          <w:bCs/>
+          <w:color w:val="595959"/>
+        </w:rPr>
+        <w:t xml:space="preserve">[3:37]  </w:t>
+      </w:r>
+      <w:r>
+        <w:rPr>
+          <w:rFonts w:ascii="Arial" w:cs="Arial" w:eastAsia="Arial" w:hAnsi="Arial"/>
+          <w:b/>
+          <w:bCs/>
+          <w:color w:val="1F4E79"/>
+        </w:rPr>
+        <w:t xml:space="preserve">Formateur : </w:t>
+      </w:r>
+      <w:r>
+        <w:rPr>
+          <w:rFonts w:ascii="Arial" w:cs="Arial" w:eastAsia="Arial" w:hAnsi="Arial"/>
+        </w:rPr>
+        <w:t xml:space="preserve">Pour le quart : jamais un boulon du cône enlevé au complet sous charge. Les trois boulons longs sans bushing, avant de desserrer les six autres boulons. Pis un tour à la fois.</w:t>
       </w:r>
     </w:p>
     <w:p>
@@ -900,7 +875,7 @@
           <w:bCs/>
           <w:color w:val="595959"/>
         </w:rPr>
-        <w:t xml:space="preserve">[2:26]  </w:t>
+        <w:t xml:space="preserve">[3:50]  </w:t>
       </w:r>
       <w:r>
         <w:rPr>
@@ -934,7 +909,7 @@
           <w:bCs/>
           <w:color w:val="595959"/>
         </w:rPr>
-        <w:t xml:space="preserve">[2:29]  </w:t>
+        <w:t xml:space="preserve">[3:53]  </w:t>
       </w:r>
       <w:r>
         <w:rPr>
@@ -968,7 +943,7 @@
           <w:bCs/>
           <w:color w:val="595959"/>
         </w:rPr>
-        <w:t xml:space="preserve">[2:17]  </w:t>
+        <w:t xml:space="preserve">[4:00]  </w:t>
       </w:r>
       <w:r>
         <w:rPr>
@@ -1002,7 +977,7 @@
           <w:bCs/>
           <w:color w:val="595959"/>
         </w:rPr>
-        <w:t xml:space="preserve">[2:19]  </w:t>
+        <w:t xml:space="preserve">[4:03]  </w:t>
       </w:r>
       <w:r>
         <w:rPr>
@@ -1036,7 +1011,7 @@
           <w:bCs/>
           <w:color w:val="595959"/>
         </w:rPr>
-        <w:t xml:space="preserve">[2:35]  </w:t>
+        <w:t xml:space="preserve">[4:10]  </w:t>
       </w:r>
       <w:r>
         <w:rPr>
@@ -1070,7 +1045,7 @@
           <w:bCs/>
           <w:color w:val="595959"/>
         </w:rPr>
-        <w:t xml:space="preserve">[2:37]  </w:t>
+        <w:t xml:space="preserve">[4:13]  </w:t>
       </w:r>
       <w:r>
         <w:rPr>
@@ -1104,7 +1079,7 @@
           <w:bCs/>
           <w:color w:val="595959"/>
         </w:rPr>
-        <w:t xml:space="preserve">[2:45]  </w:t>
+        <w:t xml:space="preserve">[4:20]  </w:t>
       </w:r>
       <w:r>
         <w:rPr>
@@ -1138,7 +1113,7 @@
           <w:bCs/>
           <w:color w:val="595959"/>
         </w:rPr>
-        <w:t xml:space="preserve">[2:50]  </w:t>
+        <w:t xml:space="preserve">[4:24]  </w:t>
       </w:r>
       <w:r>
         <w:rPr>
@@ -1172,7 +1147,7 @@
           <w:bCs/>
           <w:color w:val="595959"/>
         </w:rPr>
-        <w:t xml:space="preserve">[nouveau]  </w:t>
+        <w:t xml:space="preserve">[4:31]  </w:t>
       </w:r>
       <w:r>
         <w:rPr>
@@ -1186,7 +1161,6 @@
       <w:r>
         <w:rPr>
           <w:rFonts w:ascii="Arial" w:cs="Arial" w:eastAsia="Arial" w:hAnsi="Arial"/>
-          <w:shd w:fill="FFE97F" w:color="auto" w:val="clear"/>
         </w:rPr>
         <w:t xml:space="preserve">L'énergie résiduelle, y en a juste dans les ressorts ?</w:t>
       </w:r>
@@ -1207,21 +1181,20 @@
           <w:bCs/>
           <w:color w:val="595959"/>
         </w:rPr>
-        <w:t xml:space="preserve">[nouveau]  </w:t>
-      </w:r>
-      <w:r>
-        <w:rPr>
-          <w:rFonts w:ascii="Arial" w:cs="Arial" w:eastAsia="Arial" w:hAnsi="Arial"/>
-          <w:b/>
-          <w:bCs/>
-          <w:color w:val="1F4E79"/>
-        </w:rPr>
-        <w:t xml:space="preserve">Formateur : </w:t>
-      </w:r>
-      <w:r>
-        <w:rPr>
-          <w:rFonts w:ascii="Arial" w:cs="Arial" w:eastAsia="Arial" w:hAnsi="Arial"/>
-          <w:shd w:fill="FFE97F" w:color="auto" w:val="clear"/>
+        <w:t xml:space="preserve">[4:35]  </w:t>
+      </w:r>
+      <w:r>
+        <w:rPr>
+          <w:rFonts w:ascii="Arial" w:cs="Arial" w:eastAsia="Arial" w:hAnsi="Arial"/>
+          <w:b/>
+          <w:bCs/>
+          <w:color w:val="1F4E79"/>
+        </w:rPr>
+        <w:t xml:space="preserve">Formateur : </w:t>
+      </w:r>
+      <w:r>
+        <w:rPr>
+          <w:rFonts w:ascii="Arial" w:cs="Arial" w:eastAsia="Arial" w:hAnsi="Arial"/>
         </w:rPr>
         <w:t xml:space="preserve">Pas juste là. Il y a aussi la pression qui reste dans les boyaux hydrauliques, une pièce qui peut tomber, un câble tendu. Avant de démonter, on se demande toujours : qu'est-ce qui peut encore bouger ?</w:t>
       </w:r>
@@ -1242,7 +1215,7 @@
           <w:bCs/>
           <w:color w:val="595959"/>
         </w:rPr>
-        <w:t xml:space="preserve">[nouveau]  </w:t>
+        <w:t xml:space="preserve">[4:48]  </w:t>
       </w:r>
       <w:r>
         <w:rPr>
@@ -1256,7 +1229,6 @@
       <w:r>
         <w:rPr>
           <w:rFonts w:ascii="Arial" w:cs="Arial" w:eastAsia="Arial" w:hAnsi="Arial"/>
-          <w:shd w:fill="FFE97F" w:color="auto" w:val="clear"/>
         </w:rPr>
         <w:t xml:space="preserve">Pis si le quart finit avant que la job soit faite ?</w:t>
       </w:r>
@@ -1277,21 +1249,20 @@
           <w:bCs/>
           <w:color w:val="595959"/>
         </w:rPr>
-        <w:t xml:space="preserve">[nouveau]  </w:t>
-      </w:r>
-      <w:r>
-        <w:rPr>
-          <w:rFonts w:ascii="Arial" w:cs="Arial" w:eastAsia="Arial" w:hAnsi="Arial"/>
-          <w:b/>
-          <w:bCs/>
-          <w:color w:val="1F4E79"/>
-        </w:rPr>
-        <w:t xml:space="preserve">Formateur : </w:t>
-      </w:r>
-      <w:r>
-        <w:rPr>
-          <w:rFonts w:ascii="Arial" w:cs="Arial" w:eastAsia="Arial" w:hAnsi="Arial"/>
-          <w:shd w:fill="FFE97F" w:color="auto" w:val="clear"/>
+        <w:t xml:space="preserve">[4:51]  </w:t>
+      </w:r>
+      <w:r>
+        <w:rPr>
+          <w:rFonts w:ascii="Arial" w:cs="Arial" w:eastAsia="Arial" w:hAnsi="Arial"/>
+          <w:b/>
+          <w:bCs/>
+          <w:color w:val="1F4E79"/>
+        </w:rPr>
+        <w:t xml:space="preserve">Formateur : </w:t>
+      </w:r>
+      <w:r>
+        <w:rPr>
+          <w:rFonts w:ascii="Arial" w:cs="Arial" w:eastAsia="Arial" w:hAnsi="Arial"/>
         </w:rPr>
         <w:t xml:space="preserve">On pose un scellé sur la foreuse, avec une fiche qui explique la nature de l'intervention. Après, chacun peut enlever son cadenas. Le prochain quart sait exactement où on est rendu, pis chacun repose son cadenas avant de reprendre la job. Sans ça, quelqu'un pourrait repartir la foreuse sans savoir que le mandrin est à moitié démonté, pis que les ressorts sont peut-être encore sous charge. Le cône pourrait être projeté.</w:t>
       </w:r>
@@ -1312,7 +1283,7 @@
           <w:bCs/>
           <w:color w:val="595959"/>
         </w:rPr>
-        <w:t xml:space="preserve">[2:57]  </w:t>
+        <w:t xml:space="preserve">[5:17]  </w:t>
       </w:r>
       <w:r>
         <w:rPr>
@@ -1346,7 +1317,7 @@
           <w:bCs/>
           <w:color w:val="595959"/>
         </w:rPr>
-        <w:t xml:space="preserve">[3:00]  </w:t>
+        <w:t xml:space="preserve">[5:20]  </w:t>
       </w:r>
       <w:r>
         <w:rPr>
@@ -1380,7 +1351,7 @@
           <w:bCs/>
           <w:color w:val="595959"/>
         </w:rPr>
-        <w:t xml:space="preserve">[nouveau]  </w:t>
+        <w:t xml:space="preserve">[5:26]  </w:t>
       </w:r>
       <w:r>
         <w:rPr>
@@ -1394,7 +1365,6 @@
       <w:r>
         <w:rPr>
           <w:rFonts w:ascii="Arial" w:cs="Arial" w:eastAsia="Arial" w:hAnsi="Arial"/>
-          <w:shd w:fill="FFE97F" w:color="auto" w:val="clear"/>
         </w:rPr>
         <w:t xml:space="preserve">Sur nos équipements, où est-ce qu'il peut rester de l'énergie résiduelle après le cadenassage ? • Dans votre travail, quand est-ce que le cadenas suffit pas, pis qu'il faut contrôler une énergie qui reste ? • Qu'est-ce qu'on doit vérifier avant de démonter, une fois la foreuse cadenassée ?</w:t>
       </w:r>

</xml_diff>